<commit_message>
Arquivo final de entrega
</commit_message>
<xml_diff>
--- a/docs/relatorio/projeto_986134_Desyree_N_Garcia_Batista.docx
+++ b/docs/relatorio/projeto_986134_Desyree_N_Garcia_Batista.docx
@@ -235,17 +235,7 @@
           <w:sz w:val="32"/>
           <w:szCs w:val="32"/>
         </w:rPr>
-        <w:t xml:space="preserve"> N. Garcia Batista</w:t>
-      </w:r>
-      <w:r>
-        <w:rPr>
-          <w:rFonts w:ascii="Verdana Pro" w:hAnsi="Verdana Pro" w:cs="Arial"/>
-          <w:b/>
-          <w:bCs/>
-          <w:sz w:val="32"/>
-          <w:szCs w:val="32"/>
-        </w:rPr>
-        <w:t xml:space="preserve"> RU:  986134</w:t>
+        <w:t xml:space="preserve"> N. Garcia Batista RU:  986134</w:t>
       </w:r>
     </w:p>
     <w:p>
@@ -301,6 +291,12 @@
     </w:p>
     <w:sdt>
       <w:sdtPr>
+        <w:rPr>
+          <w:rFonts w:eastAsiaTheme="minorHAnsi" w:cstheme="minorBidi"/>
+          <w:b w:val="0"/>
+          <w:szCs w:val="22"/>
+          <w:lang w:eastAsia="en-US"/>
+        </w:rPr>
         <w:id w:val="-156228459"/>
         <w:docPartObj>
           <w:docPartGallery w:val="Table of Contents"/>
@@ -309,20 +305,25 @@
       </w:sdtPr>
       <w:sdtEndPr>
         <w:rPr>
-          <w:rFonts w:eastAsiaTheme="minorHAnsi" w:cstheme="minorBidi"/>
-          <w:bCs/>
-          <w:szCs w:val="22"/>
-          <w:lang w:eastAsia="en-US"/>
+          <w:bCs/>
         </w:rPr>
       </w:sdtEndPr>
       <w:sdtContent>
         <w:p>
           <w:pPr>
             <w:pStyle w:val="CabealhodoSumrio"/>
+            <w:jc w:val="center"/>
           </w:pPr>
           <w:r>
             <w:t>Sumário</w:t>
           </w:r>
+        </w:p>
+        <w:p>
+          <w:pPr>
+            <w:rPr>
+              <w:lang w:eastAsia="pt-BR"/>
+            </w:rPr>
+          </w:pPr>
         </w:p>
         <w:p>
           <w:pPr>
@@ -333,8 +334,8 @@
             <w:rPr>
               <w:rFonts w:asciiTheme="minorHAnsi" w:eastAsiaTheme="minorEastAsia" w:hAnsiTheme="minorHAnsi" w:cstheme="minorBidi"/>
               <w:color w:val="auto"/>
-              <w:szCs w:val="24"/>
-              <w:lang w:val="pt-BR" w:eastAsia="pt-BR"/>
+              <w:sz w:val="22"/>
+              <w:lang w:val="en-US"/>
             </w:rPr>
           </w:pPr>
           <w:r>
@@ -346,12 +347,10 @@
           <w:r>
             <w:fldChar w:fldCharType="separate"/>
           </w:r>
-          <w:hyperlink w:anchor="_Toc230188000" w:history="1">
+          <w:hyperlink w:anchor="_Toc230209402" w:history="1">
             <w:r>
               <w:rPr>
                 <w:rStyle w:val="Hyperlink"/>
-                <w:b/>
-                <w:bCs/>
               </w:rPr>
               <w:t>INTRODUÇÃO</w:t>
             </w:r>
@@ -371,72 +370,7 @@
               <w:rPr>
                 <w:webHidden/>
               </w:rPr>
-              <w:instrText xml:space="preserve"> PAGEREF _Toc230188000 \h </w:instrText>
-            </w:r>
-            <w:r>
-              <w:rPr>
-                <w:webHidden/>
-              </w:rPr>
-            </w:r>
-            <w:r>
-              <w:rPr>
-                <w:webHidden/>
-              </w:rPr>
-              <w:fldChar w:fldCharType="separate"/>
-            </w:r>
-            <w:r>
-              <w:rPr>
-                <w:webHidden/>
-              </w:rPr>
-              <w:t>3</w:t>
-            </w:r>
-            <w:r>
-              <w:rPr>
-                <w:webHidden/>
-              </w:rPr>
-              <w:fldChar w:fldCharType="end"/>
-            </w:r>
-          </w:hyperlink>
-        </w:p>
-        <w:p>
-          <w:pPr>
-            <w:pStyle w:val="Sumrio1"/>
-            <w:tabs>
-              <w:tab w:val="right" w:leader="dot" w:pos="9061"/>
-            </w:tabs>
-            <w:rPr>
-              <w:rFonts w:asciiTheme="minorHAnsi" w:eastAsiaTheme="minorEastAsia" w:hAnsiTheme="minorHAnsi" w:cstheme="minorBidi"/>
-              <w:color w:val="auto"/>
-              <w:szCs w:val="24"/>
-              <w:lang w:val="pt-BR" w:eastAsia="pt-BR"/>
-            </w:rPr>
-          </w:pPr>
-          <w:hyperlink w:anchor="_Toc230188001" w:history="1">
-            <w:r>
-              <w:rPr>
-                <w:rStyle w:val="Hyperlink"/>
-                <w:b/>
-                <w:bCs/>
-              </w:rPr>
-              <w:t>OBJETIVO:</w:t>
-            </w:r>
-            <w:r>
-              <w:rPr>
-                <w:webHidden/>
-              </w:rPr>
-              <w:tab/>
-            </w:r>
-            <w:r>
-              <w:rPr>
-                <w:webHidden/>
-              </w:rPr>
-              <w:fldChar w:fldCharType="begin"/>
-            </w:r>
-            <w:r>
-              <w:rPr>
-                <w:webHidden/>
-              </w:rPr>
-              <w:instrText xml:space="preserve"> PAGEREF _Toc230188001 \h </w:instrText>
+              <w:instrText xml:space="preserve"> PAGEREF _Toc230209402 \h </w:instrText>
             </w:r>
             <w:r>
               <w:rPr>
@@ -473,19 +407,17 @@
               <w:rFonts w:asciiTheme="minorHAnsi" w:eastAsiaTheme="minorEastAsia" w:hAnsiTheme="minorHAnsi" w:cstheme="minorBidi"/>
               <w:noProof/>
               <w:color w:val="auto"/>
-              <w:szCs w:val="24"/>
-              <w:lang w:val="pt-BR" w:eastAsia="pt-BR"/>
+              <w:sz w:val="22"/>
+              <w:lang w:val="en-US"/>
             </w:rPr>
           </w:pPr>
-          <w:hyperlink w:anchor="_Toc230188002" w:history="1">
+          <w:hyperlink w:anchor="_Toc230209403" w:history="1">
             <w:r>
               <w:rPr>
                 <w:rStyle w:val="Hyperlink"/>
-                <w:b/>
-                <w:bCs/>
-                <w:noProof/>
-              </w:rPr>
-              <w:t>Objetivo Geral:</w:t>
+                <w:noProof/>
+              </w:rPr>
+              <w:t>IMPLEMENTAÇÃO E PROTOTIPAGEM Link do Repositório:</w:t>
             </w:r>
             <w:r>
               <w:rPr>
@@ -506,7 +438,7 @@
                 <w:noProof/>
                 <w:webHidden/>
               </w:rPr>
-              <w:instrText xml:space="preserve"> PAGEREF _Toc230188002 \h </w:instrText>
+              <w:instrText xml:space="preserve"> PAGEREF _Toc230209403 \h </w:instrText>
             </w:r>
             <w:r>
               <w:rPr>
@@ -531,266 +463,6 @@
             <w:r>
               <w:rPr>
                 <w:noProof/>
-                <w:webHidden/>
-              </w:rPr>
-              <w:fldChar w:fldCharType="end"/>
-            </w:r>
-          </w:hyperlink>
-        </w:p>
-        <w:p>
-          <w:pPr>
-            <w:pStyle w:val="Sumrio1"/>
-            <w:tabs>
-              <w:tab w:val="right" w:leader="dot" w:pos="9061"/>
-            </w:tabs>
-            <w:rPr>
-              <w:rFonts w:asciiTheme="minorHAnsi" w:eastAsiaTheme="minorEastAsia" w:hAnsiTheme="minorHAnsi" w:cstheme="minorBidi"/>
-              <w:color w:val="auto"/>
-              <w:szCs w:val="24"/>
-              <w:lang w:val="pt-BR" w:eastAsia="pt-BR"/>
-            </w:rPr>
-          </w:pPr>
-          <w:hyperlink w:anchor="_Toc230188003" w:history="1">
-            <w:r>
-              <w:rPr>
-                <w:rStyle w:val="Hyperlink"/>
-                <w:b/>
-                <w:bCs/>
-              </w:rPr>
-              <w:t>DESCRIÇÃO DO SISTEMA:</w:t>
-            </w:r>
-            <w:r>
-              <w:rPr>
-                <w:webHidden/>
-              </w:rPr>
-              <w:tab/>
-            </w:r>
-            <w:r>
-              <w:rPr>
-                <w:webHidden/>
-              </w:rPr>
-              <w:fldChar w:fldCharType="begin"/>
-            </w:r>
-            <w:r>
-              <w:rPr>
-                <w:webHidden/>
-              </w:rPr>
-              <w:instrText xml:space="preserve"> PAGEREF _Toc230188003 \h </w:instrText>
-            </w:r>
-            <w:r>
-              <w:rPr>
-                <w:webHidden/>
-              </w:rPr>
-            </w:r>
-            <w:r>
-              <w:rPr>
-                <w:webHidden/>
-              </w:rPr>
-              <w:fldChar w:fldCharType="separate"/>
-            </w:r>
-            <w:r>
-              <w:rPr>
-                <w:webHidden/>
-              </w:rPr>
-              <w:t>3</w:t>
-            </w:r>
-            <w:r>
-              <w:rPr>
-                <w:webHidden/>
-              </w:rPr>
-              <w:fldChar w:fldCharType="end"/>
-            </w:r>
-          </w:hyperlink>
-        </w:p>
-        <w:p>
-          <w:pPr>
-            <w:pStyle w:val="Sumrio1"/>
-            <w:tabs>
-              <w:tab w:val="right" w:leader="dot" w:pos="9061"/>
-            </w:tabs>
-            <w:rPr>
-              <w:rFonts w:asciiTheme="minorHAnsi" w:eastAsiaTheme="minorEastAsia" w:hAnsiTheme="minorHAnsi" w:cstheme="minorBidi"/>
-              <w:color w:val="auto"/>
-              <w:szCs w:val="24"/>
-              <w:lang w:val="pt-BR" w:eastAsia="pt-BR"/>
-            </w:rPr>
-          </w:pPr>
-          <w:hyperlink w:anchor="_Toc230188004" w:history="1">
-            <w:r>
-              <w:rPr>
-                <w:rStyle w:val="Hyperlink"/>
-                <w:b/>
-                <w:bCs/>
-              </w:rPr>
-              <w:t>TECNOLOGIAS UTILIZADAS:</w:t>
-            </w:r>
-            <w:r>
-              <w:rPr>
-                <w:webHidden/>
-              </w:rPr>
-              <w:tab/>
-            </w:r>
-            <w:r>
-              <w:rPr>
-                <w:webHidden/>
-              </w:rPr>
-              <w:fldChar w:fldCharType="begin"/>
-            </w:r>
-            <w:r>
-              <w:rPr>
-                <w:webHidden/>
-              </w:rPr>
-              <w:instrText xml:space="preserve"> PAGEREF _Toc230188004 \h </w:instrText>
-            </w:r>
-            <w:r>
-              <w:rPr>
-                <w:webHidden/>
-              </w:rPr>
-            </w:r>
-            <w:r>
-              <w:rPr>
-                <w:webHidden/>
-              </w:rPr>
-              <w:fldChar w:fldCharType="separate"/>
-            </w:r>
-            <w:r>
-              <w:rPr>
-                <w:webHidden/>
-              </w:rPr>
-              <w:t>4</w:t>
-            </w:r>
-            <w:r>
-              <w:rPr>
-                <w:webHidden/>
-              </w:rPr>
-              <w:fldChar w:fldCharType="end"/>
-            </w:r>
-          </w:hyperlink>
-        </w:p>
-        <w:p>
-          <w:pPr>
-            <w:pStyle w:val="Sumrio1"/>
-            <w:tabs>
-              <w:tab w:val="right" w:leader="dot" w:pos="9061"/>
-            </w:tabs>
-            <w:rPr>
-              <w:rFonts w:asciiTheme="minorHAnsi" w:eastAsiaTheme="minorEastAsia" w:hAnsiTheme="minorHAnsi" w:cstheme="minorBidi"/>
-              <w:color w:val="auto"/>
-              <w:szCs w:val="24"/>
-              <w:lang w:val="pt-BR" w:eastAsia="pt-BR"/>
-            </w:rPr>
-          </w:pPr>
-          <w:hyperlink w:anchor="_Toc230188005" w:history="1">
-            <w:r>
-              <w:rPr>
-                <w:rStyle w:val="Hyperlink"/>
-                <w:b/>
-                <w:bCs/>
-              </w:rPr>
-              <w:t>FUNCIONALIDADES IMPLEMENTADAS:</w:t>
-            </w:r>
-            <w:r>
-              <w:rPr>
-                <w:webHidden/>
-              </w:rPr>
-              <w:tab/>
-            </w:r>
-            <w:r>
-              <w:rPr>
-                <w:webHidden/>
-              </w:rPr>
-              <w:fldChar w:fldCharType="begin"/>
-            </w:r>
-            <w:r>
-              <w:rPr>
-                <w:webHidden/>
-              </w:rPr>
-              <w:instrText xml:space="preserve"> PAGEREF _Toc230188005 \h </w:instrText>
-            </w:r>
-            <w:r>
-              <w:rPr>
-                <w:webHidden/>
-              </w:rPr>
-            </w:r>
-            <w:r>
-              <w:rPr>
-                <w:webHidden/>
-              </w:rPr>
-              <w:fldChar w:fldCharType="separate"/>
-            </w:r>
-            <w:r>
-              <w:rPr>
-                <w:webHidden/>
-              </w:rPr>
-              <w:t>4</w:t>
-            </w:r>
-            <w:r>
-              <w:rPr>
-                <w:webHidden/>
-              </w:rPr>
-              <w:fldChar w:fldCharType="end"/>
-            </w:r>
-          </w:hyperlink>
-        </w:p>
-        <w:p>
-          <w:pPr>
-            <w:pStyle w:val="Sumrio1"/>
-            <w:tabs>
-              <w:tab w:val="right" w:leader="dot" w:pos="9061"/>
-            </w:tabs>
-            <w:rPr>
-              <w:rFonts w:asciiTheme="minorHAnsi" w:eastAsiaTheme="minorEastAsia" w:hAnsiTheme="minorHAnsi" w:cstheme="minorBidi"/>
-              <w:color w:val="auto"/>
-              <w:szCs w:val="24"/>
-              <w:lang w:val="pt-BR" w:eastAsia="pt-BR"/>
-            </w:rPr>
-          </w:pPr>
-          <w:hyperlink w:anchor="_Toc230188006" w:history="1">
-            <w:r>
-              <w:rPr>
-                <w:rStyle w:val="Hyperlink"/>
-                <w:b/>
-                <w:bCs/>
-              </w:rPr>
-              <w:t>DEMONSTRAÇÃO DO SISTEMA:</w:t>
-            </w:r>
-            <w:r>
-              <w:rPr>
-                <w:webHidden/>
-              </w:rPr>
-              <w:tab/>
-            </w:r>
-            <w:r>
-              <w:rPr>
-                <w:webHidden/>
-              </w:rPr>
-              <w:fldChar w:fldCharType="begin"/>
-            </w:r>
-            <w:r>
-              <w:rPr>
-                <w:webHidden/>
-              </w:rPr>
-              <w:instrText xml:space="preserve"> PAGEREF _Toc230188006 \h </w:instrText>
-            </w:r>
-            <w:r>
-              <w:rPr>
-                <w:webHidden/>
-              </w:rPr>
-            </w:r>
-            <w:r>
-              <w:rPr>
-                <w:webHidden/>
-              </w:rPr>
-              <w:fldChar w:fldCharType="separate"/>
-            </w:r>
-            <w:r>
-              <w:rPr>
-                <w:webHidden/>
-              </w:rPr>
-              <w:t>5</w:t>
-            </w:r>
-            <w:r>
-              <w:rPr>
                 <w:webHidden/>
               </w:rPr>
               <w:fldChar w:fldCharType="end"/>
@@ -807,19 +479,17 @@
               <w:rFonts w:asciiTheme="minorHAnsi" w:eastAsiaTheme="minorEastAsia" w:hAnsiTheme="minorHAnsi" w:cstheme="minorBidi"/>
               <w:noProof/>
               <w:color w:val="auto"/>
-              <w:szCs w:val="24"/>
-              <w:lang w:val="pt-BR" w:eastAsia="pt-BR"/>
+              <w:sz w:val="22"/>
+              <w:lang w:val="en-US"/>
             </w:rPr>
           </w:pPr>
-          <w:hyperlink w:anchor="_Toc230188007" w:history="1">
+          <w:hyperlink w:anchor="_Toc230209404" w:history="1">
             <w:r>
               <w:rPr>
                 <w:rStyle w:val="Hyperlink"/>
-                <w:b/>
-                <w:bCs/>
-                <w:noProof/>
-              </w:rPr>
-              <w:t>Dashboard:</w:t>
+                <w:noProof/>
+              </w:rPr>
+              <w:t>Repositório:</w:t>
             </w:r>
             <w:r>
               <w:rPr>
@@ -840,7 +510,7 @@
                 <w:noProof/>
                 <w:webHidden/>
               </w:rPr>
-              <w:instrText xml:space="preserve"> PAGEREF _Toc230188007 \h </w:instrText>
+              <w:instrText xml:space="preserve"> PAGEREF _Toc230209404 \h </w:instrText>
             </w:r>
             <w:r>
               <w:rPr>
@@ -860,11 +530,74 @@
                 <w:noProof/>
                 <w:webHidden/>
               </w:rPr>
-              <w:t>5</w:t>
-            </w:r>
-            <w:r>
-              <w:rPr>
-                <w:noProof/>
+              <w:t>3</w:t>
+            </w:r>
+            <w:r>
+              <w:rPr>
+                <w:noProof/>
+                <w:webHidden/>
+              </w:rPr>
+              <w:fldChar w:fldCharType="end"/>
+            </w:r>
+          </w:hyperlink>
+        </w:p>
+        <w:p>
+          <w:pPr>
+            <w:pStyle w:val="Sumrio1"/>
+            <w:tabs>
+              <w:tab w:val="right" w:leader="dot" w:pos="9061"/>
+            </w:tabs>
+            <w:rPr>
+              <w:rFonts w:asciiTheme="minorHAnsi" w:eastAsiaTheme="minorEastAsia" w:hAnsiTheme="minorHAnsi" w:cstheme="minorBidi"/>
+              <w:color w:val="auto"/>
+              <w:sz w:val="22"/>
+              <w:lang w:val="en-US"/>
+            </w:rPr>
+          </w:pPr>
+          <w:hyperlink w:anchor="_Toc230209405" w:history="1">
+            <w:r>
+              <w:rPr>
+                <w:rStyle w:val="Hyperlink"/>
+              </w:rPr>
+              <w:t>OBJETIVO:</w:t>
+            </w:r>
+            <w:r>
+              <w:rPr>
+                <w:webHidden/>
+              </w:rPr>
+              <w:tab/>
+            </w:r>
+            <w:r>
+              <w:rPr>
+                <w:webHidden/>
+              </w:rPr>
+              <w:fldChar w:fldCharType="begin"/>
+            </w:r>
+            <w:r>
+              <w:rPr>
+                <w:webHidden/>
+              </w:rPr>
+              <w:instrText xml:space="preserve"> PAGEREF _Toc230209405 \h </w:instrText>
+            </w:r>
+            <w:r>
+              <w:rPr>
+                <w:webHidden/>
+              </w:rPr>
+            </w:r>
+            <w:r>
+              <w:rPr>
+                <w:webHidden/>
+              </w:rPr>
+              <w:fldChar w:fldCharType="separate"/>
+            </w:r>
+            <w:r>
+              <w:rPr>
+                <w:webHidden/>
+              </w:rPr>
+              <w:t>3</w:t>
+            </w:r>
+            <w:r>
+              <w:rPr>
                 <w:webHidden/>
               </w:rPr>
               <w:fldChar w:fldCharType="end"/>
@@ -881,19 +614,17 @@
               <w:rFonts w:asciiTheme="minorHAnsi" w:eastAsiaTheme="minorEastAsia" w:hAnsiTheme="minorHAnsi" w:cstheme="minorBidi"/>
               <w:noProof/>
               <w:color w:val="auto"/>
-              <w:szCs w:val="24"/>
-              <w:lang w:val="pt-BR" w:eastAsia="pt-BR"/>
+              <w:sz w:val="22"/>
+              <w:lang w:val="en-US"/>
             </w:rPr>
           </w:pPr>
-          <w:hyperlink w:anchor="_Toc230188008" w:history="1">
+          <w:hyperlink w:anchor="_Toc230209406" w:history="1">
             <w:r>
               <w:rPr>
                 <w:rStyle w:val="Hyperlink"/>
-                <w:b/>
-                <w:bCs/>
-                <w:noProof/>
-              </w:rPr>
-              <w:t>Cadastro:</w:t>
+                <w:noProof/>
+              </w:rPr>
+              <w:t>Objetivo Geral:</w:t>
             </w:r>
             <w:r>
               <w:rPr>
@@ -914,7 +645,7 @@
                 <w:noProof/>
                 <w:webHidden/>
               </w:rPr>
-              <w:instrText xml:space="preserve"> PAGEREF _Toc230188008 \h </w:instrText>
+              <w:instrText xml:space="preserve"> PAGEREF _Toc230209406 \h </w:instrText>
             </w:r>
             <w:r>
               <w:rPr>
@@ -934,7 +665,7 @@
                 <w:noProof/>
                 <w:webHidden/>
               </w:rPr>
-              <w:t>6</w:t>
+              <w:t>3</w:t>
             </w:r>
             <w:r>
               <w:rPr>
@@ -955,19 +686,17 @@
               <w:rFonts w:asciiTheme="minorHAnsi" w:eastAsiaTheme="minorEastAsia" w:hAnsiTheme="minorHAnsi" w:cstheme="minorBidi"/>
               <w:noProof/>
               <w:color w:val="auto"/>
-              <w:szCs w:val="24"/>
-              <w:lang w:val="pt-BR" w:eastAsia="pt-BR"/>
+              <w:sz w:val="22"/>
+              <w:lang w:val="en-US"/>
             </w:rPr>
           </w:pPr>
-          <w:hyperlink w:anchor="_Toc230188009" w:history="1">
+          <w:hyperlink w:anchor="_Toc230209407" w:history="1">
             <w:r>
               <w:rPr>
                 <w:rStyle w:val="Hyperlink"/>
-                <w:b/>
-                <w:bCs/>
-                <w:noProof/>
-              </w:rPr>
-              <w:t>Pesquisa e Filtro:</w:t>
+                <w:noProof/>
+              </w:rPr>
+              <w:t>Objetivos Específicos:</w:t>
             </w:r>
             <w:r>
               <w:rPr>
@@ -988,7 +717,7 @@
                 <w:noProof/>
                 <w:webHidden/>
               </w:rPr>
-              <w:instrText xml:space="preserve"> PAGEREF _Toc230188009 \h </w:instrText>
+              <w:instrText xml:space="preserve"> PAGEREF _Toc230209407 \h </w:instrText>
             </w:r>
             <w:r>
               <w:rPr>
@@ -1008,11 +737,263 @@
                 <w:noProof/>
                 <w:webHidden/>
               </w:rPr>
-              <w:t>6</w:t>
-            </w:r>
-            <w:r>
-              <w:rPr>
-                <w:noProof/>
+              <w:t>3</w:t>
+            </w:r>
+            <w:r>
+              <w:rPr>
+                <w:noProof/>
+                <w:webHidden/>
+              </w:rPr>
+              <w:fldChar w:fldCharType="end"/>
+            </w:r>
+          </w:hyperlink>
+        </w:p>
+        <w:p>
+          <w:pPr>
+            <w:pStyle w:val="Sumrio1"/>
+            <w:tabs>
+              <w:tab w:val="right" w:leader="dot" w:pos="9061"/>
+            </w:tabs>
+            <w:rPr>
+              <w:rFonts w:asciiTheme="minorHAnsi" w:eastAsiaTheme="minorEastAsia" w:hAnsiTheme="minorHAnsi" w:cstheme="minorBidi"/>
+              <w:color w:val="auto"/>
+              <w:sz w:val="22"/>
+              <w:lang w:val="en-US"/>
+            </w:rPr>
+          </w:pPr>
+          <w:hyperlink w:anchor="_Toc230209408" w:history="1">
+            <w:r>
+              <w:rPr>
+                <w:rStyle w:val="Hyperlink"/>
+              </w:rPr>
+              <w:t>DESCRIÇÃO DO SISTEMA:</w:t>
+            </w:r>
+            <w:r>
+              <w:rPr>
+                <w:webHidden/>
+              </w:rPr>
+              <w:tab/>
+            </w:r>
+            <w:r>
+              <w:rPr>
+                <w:webHidden/>
+              </w:rPr>
+              <w:fldChar w:fldCharType="begin"/>
+            </w:r>
+            <w:r>
+              <w:rPr>
+                <w:webHidden/>
+              </w:rPr>
+              <w:instrText xml:space="preserve"> PAGEREF _Toc230209408 \h </w:instrText>
+            </w:r>
+            <w:r>
+              <w:rPr>
+                <w:webHidden/>
+              </w:rPr>
+            </w:r>
+            <w:r>
+              <w:rPr>
+                <w:webHidden/>
+              </w:rPr>
+              <w:fldChar w:fldCharType="separate"/>
+            </w:r>
+            <w:r>
+              <w:rPr>
+                <w:webHidden/>
+              </w:rPr>
+              <w:t>4</w:t>
+            </w:r>
+            <w:r>
+              <w:rPr>
+                <w:webHidden/>
+              </w:rPr>
+              <w:fldChar w:fldCharType="end"/>
+            </w:r>
+          </w:hyperlink>
+        </w:p>
+        <w:p>
+          <w:pPr>
+            <w:pStyle w:val="Sumrio1"/>
+            <w:tabs>
+              <w:tab w:val="right" w:leader="dot" w:pos="9061"/>
+            </w:tabs>
+            <w:rPr>
+              <w:rFonts w:asciiTheme="minorHAnsi" w:eastAsiaTheme="minorEastAsia" w:hAnsiTheme="minorHAnsi" w:cstheme="minorBidi"/>
+              <w:color w:val="auto"/>
+              <w:sz w:val="22"/>
+              <w:lang w:val="en-US"/>
+            </w:rPr>
+          </w:pPr>
+          <w:hyperlink w:anchor="_Toc230209409" w:history="1">
+            <w:r>
+              <w:rPr>
+                <w:rStyle w:val="Hyperlink"/>
+              </w:rPr>
+              <w:t>TECNOLOGIAS UTILIZADAS:</w:t>
+            </w:r>
+            <w:r>
+              <w:rPr>
+                <w:webHidden/>
+              </w:rPr>
+              <w:tab/>
+            </w:r>
+            <w:r>
+              <w:rPr>
+                <w:webHidden/>
+              </w:rPr>
+              <w:fldChar w:fldCharType="begin"/>
+            </w:r>
+            <w:r>
+              <w:rPr>
+                <w:webHidden/>
+              </w:rPr>
+              <w:instrText xml:space="preserve"> PAGEREF _Toc230209409 \h </w:instrText>
+            </w:r>
+            <w:r>
+              <w:rPr>
+                <w:webHidden/>
+              </w:rPr>
+            </w:r>
+            <w:r>
+              <w:rPr>
+                <w:webHidden/>
+              </w:rPr>
+              <w:fldChar w:fldCharType="separate"/>
+            </w:r>
+            <w:r>
+              <w:rPr>
+                <w:webHidden/>
+              </w:rPr>
+              <w:t>4</w:t>
+            </w:r>
+            <w:r>
+              <w:rPr>
+                <w:webHidden/>
+              </w:rPr>
+              <w:fldChar w:fldCharType="end"/>
+            </w:r>
+          </w:hyperlink>
+        </w:p>
+        <w:p>
+          <w:pPr>
+            <w:pStyle w:val="Sumrio1"/>
+            <w:tabs>
+              <w:tab w:val="right" w:leader="dot" w:pos="9061"/>
+            </w:tabs>
+            <w:rPr>
+              <w:rFonts w:asciiTheme="minorHAnsi" w:eastAsiaTheme="minorEastAsia" w:hAnsiTheme="minorHAnsi" w:cstheme="minorBidi"/>
+              <w:color w:val="auto"/>
+              <w:sz w:val="22"/>
+              <w:lang w:val="en-US"/>
+            </w:rPr>
+          </w:pPr>
+          <w:hyperlink w:anchor="_Toc230209410" w:history="1">
+            <w:r>
+              <w:rPr>
+                <w:rStyle w:val="Hyperlink"/>
+              </w:rPr>
+              <w:t>FUNCIONALIDADES IMPLEMENTADAS:</w:t>
+            </w:r>
+            <w:r>
+              <w:rPr>
+                <w:webHidden/>
+              </w:rPr>
+              <w:tab/>
+            </w:r>
+            <w:r>
+              <w:rPr>
+                <w:webHidden/>
+              </w:rPr>
+              <w:fldChar w:fldCharType="begin"/>
+            </w:r>
+            <w:r>
+              <w:rPr>
+                <w:webHidden/>
+              </w:rPr>
+              <w:instrText xml:space="preserve"> PAGEREF _Toc230209410 \h </w:instrText>
+            </w:r>
+            <w:r>
+              <w:rPr>
+                <w:webHidden/>
+              </w:rPr>
+            </w:r>
+            <w:r>
+              <w:rPr>
+                <w:webHidden/>
+              </w:rPr>
+              <w:fldChar w:fldCharType="separate"/>
+            </w:r>
+            <w:r>
+              <w:rPr>
+                <w:webHidden/>
+              </w:rPr>
+              <w:t>5</w:t>
+            </w:r>
+            <w:r>
+              <w:rPr>
+                <w:webHidden/>
+              </w:rPr>
+              <w:fldChar w:fldCharType="end"/>
+            </w:r>
+          </w:hyperlink>
+        </w:p>
+        <w:p>
+          <w:pPr>
+            <w:pStyle w:val="Sumrio1"/>
+            <w:tabs>
+              <w:tab w:val="right" w:leader="dot" w:pos="9061"/>
+            </w:tabs>
+            <w:rPr>
+              <w:rFonts w:asciiTheme="minorHAnsi" w:eastAsiaTheme="minorEastAsia" w:hAnsiTheme="minorHAnsi" w:cstheme="minorBidi"/>
+              <w:color w:val="auto"/>
+              <w:sz w:val="22"/>
+              <w:lang w:val="en-US"/>
+            </w:rPr>
+          </w:pPr>
+          <w:hyperlink w:anchor="_Toc230209411" w:history="1">
+            <w:r>
+              <w:rPr>
+                <w:rStyle w:val="Hyperlink"/>
+              </w:rPr>
+              <w:t>DEMONSTRAÇÃO DO SISTEMA:</w:t>
+            </w:r>
+            <w:r>
+              <w:rPr>
+                <w:webHidden/>
+              </w:rPr>
+              <w:tab/>
+            </w:r>
+            <w:r>
+              <w:rPr>
+                <w:webHidden/>
+              </w:rPr>
+              <w:fldChar w:fldCharType="begin"/>
+            </w:r>
+            <w:r>
+              <w:rPr>
+                <w:webHidden/>
+              </w:rPr>
+              <w:instrText xml:space="preserve"> PAGEREF _Toc230209411 \h </w:instrText>
+            </w:r>
+            <w:r>
+              <w:rPr>
+                <w:webHidden/>
+              </w:rPr>
+            </w:r>
+            <w:r>
+              <w:rPr>
+                <w:webHidden/>
+              </w:rPr>
+              <w:fldChar w:fldCharType="separate"/>
+            </w:r>
+            <w:r>
+              <w:rPr>
+                <w:webHidden/>
+              </w:rPr>
+              <w:t>5</w:t>
+            </w:r>
+            <w:r>
+              <w:rPr>
                 <w:webHidden/>
               </w:rPr>
               <w:fldChar w:fldCharType="end"/>
@@ -1029,19 +1010,17 @@
               <w:rFonts w:asciiTheme="minorHAnsi" w:eastAsiaTheme="minorEastAsia" w:hAnsiTheme="minorHAnsi" w:cstheme="minorBidi"/>
               <w:noProof/>
               <w:color w:val="auto"/>
-              <w:szCs w:val="24"/>
-              <w:lang w:val="pt-BR" w:eastAsia="pt-BR"/>
+              <w:sz w:val="22"/>
+              <w:lang w:val="en-US"/>
             </w:rPr>
           </w:pPr>
-          <w:hyperlink w:anchor="_Toc230188010" w:history="1">
+          <w:hyperlink w:anchor="_Toc230209412" w:history="1">
             <w:r>
               <w:rPr>
                 <w:rStyle w:val="Hyperlink"/>
-                <w:b/>
-                <w:bCs/>
-                <w:noProof/>
-              </w:rPr>
-              <w:t>Estatísticas:</w:t>
+                <w:noProof/>
+              </w:rPr>
+              <w:t>Dashboard:</w:t>
             </w:r>
             <w:r>
               <w:rPr>
@@ -1062,7 +1041,7 @@
                 <w:noProof/>
                 <w:webHidden/>
               </w:rPr>
-              <w:instrText xml:space="preserve"> PAGEREF _Toc230188010 \h </w:instrText>
+              <w:instrText xml:space="preserve"> PAGEREF _Toc230209412 \h </w:instrText>
             </w:r>
             <w:r>
               <w:rPr>
@@ -1082,7 +1061,7 @@
                 <w:noProof/>
                 <w:webHidden/>
               </w:rPr>
-              <w:t>7</w:t>
+              <w:t>5</w:t>
             </w:r>
             <w:r>
               <w:rPr>
@@ -1103,19 +1082,17 @@
               <w:rFonts w:asciiTheme="minorHAnsi" w:eastAsiaTheme="minorEastAsia" w:hAnsiTheme="minorHAnsi" w:cstheme="minorBidi"/>
               <w:noProof/>
               <w:color w:val="auto"/>
-              <w:szCs w:val="24"/>
-              <w:lang w:val="pt-BR" w:eastAsia="pt-BR"/>
+              <w:sz w:val="22"/>
+              <w:lang w:val="en-US"/>
             </w:rPr>
           </w:pPr>
-          <w:hyperlink w:anchor="_Toc230188011" w:history="1">
+          <w:hyperlink w:anchor="_Toc230209413" w:history="1">
             <w:r>
               <w:rPr>
                 <w:rStyle w:val="Hyperlink"/>
-                <w:b/>
-                <w:bCs/>
-                <w:noProof/>
-              </w:rPr>
-              <w:t>Tema Escuro:</w:t>
+                <w:noProof/>
+              </w:rPr>
+              <w:t>Cadastro:</w:t>
             </w:r>
             <w:r>
               <w:rPr>
@@ -1136,7 +1113,7 @@
                 <w:noProof/>
                 <w:webHidden/>
               </w:rPr>
-              <w:instrText xml:space="preserve"> PAGEREF _Toc230188011 \h </w:instrText>
+              <w:instrText xml:space="preserve"> PAGEREF _Toc230209413 \h </w:instrText>
             </w:r>
             <w:r>
               <w:rPr>
@@ -1156,7 +1133,7 @@
                 <w:noProof/>
                 <w:webHidden/>
               </w:rPr>
-              <w:t>7</w:t>
+              <w:t>6</w:t>
             </w:r>
             <w:r>
               <w:rPr>
@@ -1177,16 +1154,230 @@
               <w:rFonts w:asciiTheme="minorHAnsi" w:eastAsiaTheme="minorEastAsia" w:hAnsiTheme="minorHAnsi" w:cstheme="minorBidi"/>
               <w:noProof/>
               <w:color w:val="auto"/>
-              <w:szCs w:val="24"/>
-              <w:lang w:val="pt-BR" w:eastAsia="pt-BR"/>
+              <w:sz w:val="22"/>
+              <w:lang w:val="en-US"/>
             </w:rPr>
           </w:pPr>
-          <w:hyperlink w:anchor="_Toc230188012" w:history="1">
+          <w:hyperlink w:anchor="_Toc230209414" w:history="1">
             <w:r>
               <w:rPr>
                 <w:rStyle w:val="Hyperlink"/>
-                <w:b/>
-                <w:bCs/>
+                <w:noProof/>
+              </w:rPr>
+              <w:t>Pesquisa e Filtro:</w:t>
+            </w:r>
+            <w:r>
+              <w:rPr>
+                <w:noProof/>
+                <w:webHidden/>
+              </w:rPr>
+              <w:tab/>
+            </w:r>
+            <w:r>
+              <w:rPr>
+                <w:noProof/>
+                <w:webHidden/>
+              </w:rPr>
+              <w:fldChar w:fldCharType="begin"/>
+            </w:r>
+            <w:r>
+              <w:rPr>
+                <w:noProof/>
+                <w:webHidden/>
+              </w:rPr>
+              <w:instrText xml:space="preserve"> PAGEREF _Toc230209414 \h </w:instrText>
+            </w:r>
+            <w:r>
+              <w:rPr>
+                <w:noProof/>
+                <w:webHidden/>
+              </w:rPr>
+            </w:r>
+            <w:r>
+              <w:rPr>
+                <w:noProof/>
+                <w:webHidden/>
+              </w:rPr>
+              <w:fldChar w:fldCharType="separate"/>
+            </w:r>
+            <w:r>
+              <w:rPr>
+                <w:noProof/>
+                <w:webHidden/>
+              </w:rPr>
+              <w:t>6</w:t>
+            </w:r>
+            <w:r>
+              <w:rPr>
+                <w:noProof/>
+                <w:webHidden/>
+              </w:rPr>
+              <w:fldChar w:fldCharType="end"/>
+            </w:r>
+          </w:hyperlink>
+        </w:p>
+        <w:p>
+          <w:pPr>
+            <w:pStyle w:val="Sumrio2"/>
+            <w:tabs>
+              <w:tab w:val="right" w:leader="dot" w:pos="9061"/>
+            </w:tabs>
+            <w:rPr>
+              <w:rFonts w:asciiTheme="minorHAnsi" w:eastAsiaTheme="minorEastAsia" w:hAnsiTheme="minorHAnsi" w:cstheme="minorBidi"/>
+              <w:noProof/>
+              <w:color w:val="auto"/>
+              <w:sz w:val="22"/>
+              <w:lang w:val="en-US"/>
+            </w:rPr>
+          </w:pPr>
+          <w:hyperlink w:anchor="_Toc230209415" w:history="1">
+            <w:r>
+              <w:rPr>
+                <w:rStyle w:val="Hyperlink"/>
+                <w:noProof/>
+              </w:rPr>
+              <w:t>Estatísticas:</w:t>
+            </w:r>
+            <w:r>
+              <w:rPr>
+                <w:noProof/>
+                <w:webHidden/>
+              </w:rPr>
+              <w:tab/>
+            </w:r>
+            <w:r>
+              <w:rPr>
+                <w:noProof/>
+                <w:webHidden/>
+              </w:rPr>
+              <w:fldChar w:fldCharType="begin"/>
+            </w:r>
+            <w:r>
+              <w:rPr>
+                <w:noProof/>
+                <w:webHidden/>
+              </w:rPr>
+              <w:instrText xml:space="preserve"> PAGEREF _Toc230209415 \h </w:instrText>
+            </w:r>
+            <w:r>
+              <w:rPr>
+                <w:noProof/>
+                <w:webHidden/>
+              </w:rPr>
+            </w:r>
+            <w:r>
+              <w:rPr>
+                <w:noProof/>
+                <w:webHidden/>
+              </w:rPr>
+              <w:fldChar w:fldCharType="separate"/>
+            </w:r>
+            <w:r>
+              <w:rPr>
+                <w:noProof/>
+                <w:webHidden/>
+              </w:rPr>
+              <w:t>7</w:t>
+            </w:r>
+            <w:r>
+              <w:rPr>
+                <w:noProof/>
+                <w:webHidden/>
+              </w:rPr>
+              <w:fldChar w:fldCharType="end"/>
+            </w:r>
+          </w:hyperlink>
+        </w:p>
+        <w:p>
+          <w:pPr>
+            <w:pStyle w:val="Sumrio2"/>
+            <w:tabs>
+              <w:tab w:val="right" w:leader="dot" w:pos="9061"/>
+            </w:tabs>
+            <w:rPr>
+              <w:rFonts w:asciiTheme="minorHAnsi" w:eastAsiaTheme="minorEastAsia" w:hAnsiTheme="minorHAnsi" w:cstheme="minorBidi"/>
+              <w:noProof/>
+              <w:color w:val="auto"/>
+              <w:sz w:val="22"/>
+              <w:lang w:val="en-US"/>
+            </w:rPr>
+          </w:pPr>
+          <w:hyperlink w:anchor="_Toc230209416" w:history="1">
+            <w:r>
+              <w:rPr>
+                <w:rStyle w:val="Hyperlink"/>
+                <w:noProof/>
+              </w:rPr>
+              <w:t>Tema Escuro:</w:t>
+            </w:r>
+            <w:r>
+              <w:rPr>
+                <w:noProof/>
+                <w:webHidden/>
+              </w:rPr>
+              <w:tab/>
+            </w:r>
+            <w:r>
+              <w:rPr>
+                <w:noProof/>
+                <w:webHidden/>
+              </w:rPr>
+              <w:fldChar w:fldCharType="begin"/>
+            </w:r>
+            <w:r>
+              <w:rPr>
+                <w:noProof/>
+                <w:webHidden/>
+              </w:rPr>
+              <w:instrText xml:space="preserve"> PAGEREF _Toc230209416 \h </w:instrText>
+            </w:r>
+            <w:r>
+              <w:rPr>
+                <w:noProof/>
+                <w:webHidden/>
+              </w:rPr>
+            </w:r>
+            <w:r>
+              <w:rPr>
+                <w:noProof/>
+                <w:webHidden/>
+              </w:rPr>
+              <w:fldChar w:fldCharType="separate"/>
+            </w:r>
+            <w:r>
+              <w:rPr>
+                <w:noProof/>
+                <w:webHidden/>
+              </w:rPr>
+              <w:t>7</w:t>
+            </w:r>
+            <w:r>
+              <w:rPr>
+                <w:noProof/>
+                <w:webHidden/>
+              </w:rPr>
+              <w:fldChar w:fldCharType="end"/>
+            </w:r>
+          </w:hyperlink>
+        </w:p>
+        <w:p>
+          <w:pPr>
+            <w:pStyle w:val="Sumrio2"/>
+            <w:tabs>
+              <w:tab w:val="right" w:leader="dot" w:pos="9061"/>
+            </w:tabs>
+            <w:rPr>
+              <w:rFonts w:asciiTheme="minorHAnsi" w:eastAsiaTheme="minorEastAsia" w:hAnsiTheme="minorHAnsi" w:cstheme="minorBidi"/>
+              <w:noProof/>
+              <w:color w:val="auto"/>
+              <w:sz w:val="22"/>
+              <w:lang w:val="en-US"/>
+            </w:rPr>
+          </w:pPr>
+          <w:hyperlink w:anchor="_Toc230209417" w:history="1">
+            <w:r>
+              <w:rPr>
+                <w:rStyle w:val="Hyperlink"/>
                 <w:noProof/>
               </w:rPr>
               <w:t>Sobre:</w:t>
@@ -1210,7 +1401,7 @@
                 <w:noProof/>
                 <w:webHidden/>
               </w:rPr>
-              <w:instrText xml:space="preserve"> PAGEREF _Toc230188012 \h </w:instrText>
+              <w:instrText xml:space="preserve"> PAGEREF _Toc230209417 \h </w:instrText>
             </w:r>
             <w:r>
               <w:rPr>
@@ -1250,18 +1441,16 @@
             <w:rPr>
               <w:rFonts w:asciiTheme="minorHAnsi" w:eastAsiaTheme="minorEastAsia" w:hAnsiTheme="minorHAnsi" w:cstheme="minorBidi"/>
               <w:color w:val="auto"/>
-              <w:szCs w:val="24"/>
-              <w:lang w:val="pt-BR" w:eastAsia="pt-BR"/>
+              <w:sz w:val="22"/>
+              <w:lang w:val="en-US"/>
             </w:rPr>
           </w:pPr>
-          <w:hyperlink w:anchor="_Toc230188013" w:history="1">
+          <w:hyperlink w:anchor="_Toc230209418" w:history="1">
             <w:r>
               <w:rPr>
                 <w:rStyle w:val="Hyperlink"/>
-                <w:b/>
-                <w:bCs/>
-              </w:rPr>
-              <w:t>CONSIDERAÇÕES FINAIS:</w:t>
+              </w:rPr>
+              <w:t>OBSERVAÇÕES FINAIS</w:t>
             </w:r>
             <w:r>
               <w:rPr>
@@ -1279,7 +1468,7 @@
               <w:rPr>
                 <w:webHidden/>
               </w:rPr>
-              <w:instrText xml:space="preserve"> PAGEREF _Toc230188013 \h </w:instrText>
+              <w:instrText xml:space="preserve"> PAGEREF _Toc230209418 \h </w:instrText>
             </w:r>
             <w:r>
               <w:rPr>
@@ -1307,11 +1496,732 @@
           </w:hyperlink>
         </w:p>
         <w:p>
+          <w:pPr>
+            <w:pStyle w:val="Sumrio2"/>
+            <w:tabs>
+              <w:tab w:val="right" w:leader="dot" w:pos="9061"/>
+            </w:tabs>
+            <w:rPr>
+              <w:rFonts w:asciiTheme="minorHAnsi" w:eastAsiaTheme="minorEastAsia" w:hAnsiTheme="minorHAnsi" w:cstheme="minorBidi"/>
+              <w:noProof/>
+              <w:color w:val="auto"/>
+              <w:sz w:val="22"/>
+              <w:lang w:val="en-US"/>
+            </w:rPr>
+          </w:pPr>
+          <w:hyperlink w:anchor="_Toc230209419" w:history="1">
+            <w:r>
+              <w:rPr>
+                <w:rStyle w:val="Hyperlink"/>
+                <w:noProof/>
+              </w:rPr>
+              <w:t>Instruções de configuração:</w:t>
+            </w:r>
+            <w:r>
+              <w:rPr>
+                <w:noProof/>
+                <w:webHidden/>
+              </w:rPr>
+              <w:tab/>
+            </w:r>
+            <w:r>
+              <w:rPr>
+                <w:noProof/>
+                <w:webHidden/>
+              </w:rPr>
+              <w:fldChar w:fldCharType="begin"/>
+            </w:r>
+            <w:r>
+              <w:rPr>
+                <w:noProof/>
+                <w:webHidden/>
+              </w:rPr>
+              <w:instrText xml:space="preserve"> PAGEREF _Toc230209419 \h </w:instrText>
+            </w:r>
+            <w:r>
+              <w:rPr>
+                <w:noProof/>
+                <w:webHidden/>
+              </w:rPr>
+            </w:r>
+            <w:r>
+              <w:rPr>
+                <w:noProof/>
+                <w:webHidden/>
+              </w:rPr>
+              <w:fldChar w:fldCharType="separate"/>
+            </w:r>
+            <w:r>
+              <w:rPr>
+                <w:noProof/>
+                <w:webHidden/>
+              </w:rPr>
+              <w:t>8</w:t>
+            </w:r>
+            <w:r>
+              <w:rPr>
+                <w:noProof/>
+                <w:webHidden/>
+              </w:rPr>
+              <w:fldChar w:fldCharType="end"/>
+            </w:r>
+          </w:hyperlink>
+        </w:p>
+        <w:p>
+          <w:pPr>
+            <w:pStyle w:val="Sumrio2"/>
+            <w:tabs>
+              <w:tab w:val="right" w:leader="dot" w:pos="9061"/>
+            </w:tabs>
+            <w:rPr>
+              <w:rFonts w:asciiTheme="minorHAnsi" w:eastAsiaTheme="minorEastAsia" w:hAnsiTheme="minorHAnsi" w:cstheme="minorBidi"/>
+              <w:noProof/>
+              <w:color w:val="auto"/>
+              <w:sz w:val="22"/>
+              <w:lang w:val="en-US"/>
+            </w:rPr>
+          </w:pPr>
+          <w:hyperlink w:anchor="_Toc230209420" w:history="1">
+            <w:r>
+              <w:rPr>
+                <w:rStyle w:val="Hyperlink"/>
+                <w:noProof/>
+              </w:rPr>
+              <w:t>Para execução do projeto é necessário:</w:t>
+            </w:r>
+            <w:r>
+              <w:rPr>
+                <w:noProof/>
+                <w:webHidden/>
+              </w:rPr>
+              <w:tab/>
+            </w:r>
+            <w:r>
+              <w:rPr>
+                <w:noProof/>
+                <w:webHidden/>
+              </w:rPr>
+              <w:fldChar w:fldCharType="begin"/>
+            </w:r>
+            <w:r>
+              <w:rPr>
+                <w:noProof/>
+                <w:webHidden/>
+              </w:rPr>
+              <w:instrText xml:space="preserve"> PAGEREF _Toc230209420 \h </w:instrText>
+            </w:r>
+            <w:r>
+              <w:rPr>
+                <w:noProof/>
+                <w:webHidden/>
+              </w:rPr>
+            </w:r>
+            <w:r>
+              <w:rPr>
+                <w:noProof/>
+                <w:webHidden/>
+              </w:rPr>
+              <w:fldChar w:fldCharType="separate"/>
+            </w:r>
+            <w:r>
+              <w:rPr>
+                <w:noProof/>
+                <w:webHidden/>
+              </w:rPr>
+              <w:t>8</w:t>
+            </w:r>
+            <w:r>
+              <w:rPr>
+                <w:noProof/>
+                <w:webHidden/>
+              </w:rPr>
+              <w:fldChar w:fldCharType="end"/>
+            </w:r>
+          </w:hyperlink>
+        </w:p>
+        <w:p>
+          <w:pPr>
+            <w:pStyle w:val="Sumrio2"/>
+            <w:tabs>
+              <w:tab w:val="right" w:leader="dot" w:pos="9061"/>
+            </w:tabs>
+            <w:rPr>
+              <w:rFonts w:asciiTheme="minorHAnsi" w:eastAsiaTheme="minorEastAsia" w:hAnsiTheme="minorHAnsi" w:cstheme="minorBidi"/>
+              <w:noProof/>
+              <w:color w:val="auto"/>
+              <w:sz w:val="22"/>
+              <w:lang w:val="en-US"/>
+            </w:rPr>
+          </w:pPr>
+          <w:hyperlink w:anchor="_Toc230209421" w:history="1">
+            <w:r>
+              <w:rPr>
+                <w:rStyle w:val="Hyperlink"/>
+                <w:noProof/>
+              </w:rPr>
+              <w:t>Dependências obtidas através do comando:</w:t>
+            </w:r>
+            <w:r>
+              <w:rPr>
+                <w:noProof/>
+                <w:webHidden/>
+              </w:rPr>
+              <w:tab/>
+            </w:r>
+            <w:r>
+              <w:rPr>
+                <w:noProof/>
+                <w:webHidden/>
+              </w:rPr>
+              <w:fldChar w:fldCharType="begin"/>
+            </w:r>
+            <w:r>
+              <w:rPr>
+                <w:noProof/>
+                <w:webHidden/>
+              </w:rPr>
+              <w:instrText xml:space="preserve"> PAGEREF _Toc230209421 \h </w:instrText>
+            </w:r>
+            <w:r>
+              <w:rPr>
+                <w:noProof/>
+                <w:webHidden/>
+              </w:rPr>
+            </w:r>
+            <w:r>
+              <w:rPr>
+                <w:noProof/>
+                <w:webHidden/>
+              </w:rPr>
+              <w:fldChar w:fldCharType="separate"/>
+            </w:r>
+            <w:r>
+              <w:rPr>
+                <w:noProof/>
+                <w:webHidden/>
+              </w:rPr>
+              <w:t>8</w:t>
+            </w:r>
+            <w:r>
+              <w:rPr>
+                <w:noProof/>
+                <w:webHidden/>
+              </w:rPr>
+              <w:fldChar w:fldCharType="end"/>
+            </w:r>
+          </w:hyperlink>
+        </w:p>
+        <w:p>
+          <w:pPr>
+            <w:pStyle w:val="Sumrio2"/>
+            <w:tabs>
+              <w:tab w:val="right" w:leader="dot" w:pos="9061"/>
+            </w:tabs>
+            <w:rPr>
+              <w:rFonts w:asciiTheme="minorHAnsi" w:eastAsiaTheme="minorEastAsia" w:hAnsiTheme="minorHAnsi" w:cstheme="minorBidi"/>
+              <w:noProof/>
+              <w:color w:val="auto"/>
+              <w:sz w:val="22"/>
+              <w:lang w:val="en-US"/>
+            </w:rPr>
+          </w:pPr>
+          <w:hyperlink w:anchor="_Toc230209422" w:history="1">
+            <w:r>
+              <w:rPr>
+                <w:rStyle w:val="Hyperlink"/>
+                <w:noProof/>
+              </w:rPr>
+              <w:t>Para execução:</w:t>
+            </w:r>
+            <w:r>
+              <w:rPr>
+                <w:noProof/>
+                <w:webHidden/>
+              </w:rPr>
+              <w:tab/>
+            </w:r>
+            <w:r>
+              <w:rPr>
+                <w:noProof/>
+                <w:webHidden/>
+              </w:rPr>
+              <w:fldChar w:fldCharType="begin"/>
+            </w:r>
+            <w:r>
+              <w:rPr>
+                <w:noProof/>
+                <w:webHidden/>
+              </w:rPr>
+              <w:instrText xml:space="preserve"> PAGEREF _Toc230209422 \h </w:instrText>
+            </w:r>
+            <w:r>
+              <w:rPr>
+                <w:noProof/>
+                <w:webHidden/>
+              </w:rPr>
+            </w:r>
+            <w:r>
+              <w:rPr>
+                <w:noProof/>
+                <w:webHidden/>
+              </w:rPr>
+              <w:fldChar w:fldCharType="separate"/>
+            </w:r>
+            <w:r>
+              <w:rPr>
+                <w:noProof/>
+                <w:webHidden/>
+              </w:rPr>
+              <w:t>9</w:t>
+            </w:r>
+            <w:r>
+              <w:rPr>
+                <w:noProof/>
+                <w:webHidden/>
+              </w:rPr>
+              <w:fldChar w:fldCharType="end"/>
+            </w:r>
+          </w:hyperlink>
+        </w:p>
+        <w:p>
+          <w:pPr>
+            <w:pStyle w:val="Sumrio2"/>
+            <w:tabs>
+              <w:tab w:val="right" w:leader="dot" w:pos="9061"/>
+            </w:tabs>
+            <w:rPr>
+              <w:rFonts w:asciiTheme="minorHAnsi" w:eastAsiaTheme="minorEastAsia" w:hAnsiTheme="minorHAnsi" w:cstheme="minorBidi"/>
+              <w:noProof/>
+              <w:color w:val="auto"/>
+              <w:sz w:val="22"/>
+              <w:lang w:val="en-US"/>
+            </w:rPr>
+          </w:pPr>
+          <w:hyperlink w:anchor="_Toc230209423" w:history="1">
+            <w:r>
+              <w:rPr>
+                <w:rStyle w:val="Hyperlink"/>
+                <w:noProof/>
+                <w:lang w:val="en-US"/>
+              </w:rPr>
+              <w:t>Compilação Windows:</w:t>
+            </w:r>
+            <w:r>
+              <w:rPr>
+                <w:noProof/>
+                <w:webHidden/>
+              </w:rPr>
+              <w:tab/>
+            </w:r>
+            <w:r>
+              <w:rPr>
+                <w:noProof/>
+                <w:webHidden/>
+              </w:rPr>
+              <w:fldChar w:fldCharType="begin"/>
+            </w:r>
+            <w:r>
+              <w:rPr>
+                <w:noProof/>
+                <w:webHidden/>
+              </w:rPr>
+              <w:instrText xml:space="preserve"> PAGEREF _Toc230209423 \h </w:instrText>
+            </w:r>
+            <w:r>
+              <w:rPr>
+                <w:noProof/>
+                <w:webHidden/>
+              </w:rPr>
+            </w:r>
+            <w:r>
+              <w:rPr>
+                <w:noProof/>
+                <w:webHidden/>
+              </w:rPr>
+              <w:fldChar w:fldCharType="separate"/>
+            </w:r>
+            <w:r>
+              <w:rPr>
+                <w:noProof/>
+                <w:webHidden/>
+              </w:rPr>
+              <w:t>9</w:t>
+            </w:r>
+            <w:r>
+              <w:rPr>
+                <w:noProof/>
+                <w:webHidden/>
+              </w:rPr>
+              <w:fldChar w:fldCharType="end"/>
+            </w:r>
+          </w:hyperlink>
+        </w:p>
+        <w:p>
+          <w:pPr>
+            <w:pStyle w:val="Sumrio2"/>
+            <w:tabs>
+              <w:tab w:val="right" w:leader="dot" w:pos="9061"/>
+            </w:tabs>
+            <w:rPr>
+              <w:rFonts w:asciiTheme="minorHAnsi" w:eastAsiaTheme="minorEastAsia" w:hAnsiTheme="minorHAnsi" w:cstheme="minorBidi"/>
+              <w:noProof/>
+              <w:color w:val="auto"/>
+              <w:sz w:val="22"/>
+              <w:lang w:val="en-US"/>
+            </w:rPr>
+          </w:pPr>
+          <w:hyperlink w:anchor="_Toc230209424" w:history="1">
+            <w:r>
+              <w:rPr>
+                <w:rStyle w:val="Hyperlink"/>
+                <w:noProof/>
+                <w:lang w:val="en-US"/>
+              </w:rPr>
+              <w:t>Compilação Android:</w:t>
+            </w:r>
+            <w:r>
+              <w:rPr>
+                <w:noProof/>
+                <w:webHidden/>
+              </w:rPr>
+              <w:tab/>
+            </w:r>
+            <w:r>
+              <w:rPr>
+                <w:noProof/>
+                <w:webHidden/>
+              </w:rPr>
+              <w:fldChar w:fldCharType="begin"/>
+            </w:r>
+            <w:r>
+              <w:rPr>
+                <w:noProof/>
+                <w:webHidden/>
+              </w:rPr>
+              <w:instrText xml:space="preserve"> PAGEREF _Toc230209424 \h </w:instrText>
+            </w:r>
+            <w:r>
+              <w:rPr>
+                <w:noProof/>
+                <w:webHidden/>
+              </w:rPr>
+            </w:r>
+            <w:r>
+              <w:rPr>
+                <w:noProof/>
+                <w:webHidden/>
+              </w:rPr>
+              <w:fldChar w:fldCharType="separate"/>
+            </w:r>
+            <w:r>
+              <w:rPr>
+                <w:noProof/>
+                <w:webHidden/>
+              </w:rPr>
+              <w:t>9</w:t>
+            </w:r>
+            <w:r>
+              <w:rPr>
+                <w:noProof/>
+                <w:webHidden/>
+              </w:rPr>
+              <w:fldChar w:fldCharType="end"/>
+            </w:r>
+          </w:hyperlink>
+        </w:p>
+        <w:p>
+          <w:pPr>
+            <w:pStyle w:val="Sumrio2"/>
+            <w:tabs>
+              <w:tab w:val="right" w:leader="dot" w:pos="9061"/>
+            </w:tabs>
+            <w:rPr>
+              <w:rFonts w:asciiTheme="minorHAnsi" w:eastAsiaTheme="minorEastAsia" w:hAnsiTheme="minorHAnsi" w:cstheme="minorBidi"/>
+              <w:noProof/>
+              <w:color w:val="auto"/>
+              <w:sz w:val="22"/>
+              <w:lang w:val="en-US"/>
+            </w:rPr>
+          </w:pPr>
+          <w:hyperlink w:anchor="_Toc230209425" w:history="1">
+            <w:r>
+              <w:rPr>
+                <w:rStyle w:val="Hyperlink"/>
+                <w:noProof/>
+              </w:rPr>
+              <w:t>Banco de dados:</w:t>
+            </w:r>
+            <w:r>
+              <w:rPr>
+                <w:noProof/>
+                <w:webHidden/>
+              </w:rPr>
+              <w:tab/>
+            </w:r>
+            <w:r>
+              <w:rPr>
+                <w:noProof/>
+                <w:webHidden/>
+              </w:rPr>
+              <w:fldChar w:fldCharType="begin"/>
+            </w:r>
+            <w:r>
+              <w:rPr>
+                <w:noProof/>
+                <w:webHidden/>
+              </w:rPr>
+              <w:instrText xml:space="preserve"> PAGEREF _Toc230209425 \h </w:instrText>
+            </w:r>
+            <w:r>
+              <w:rPr>
+                <w:noProof/>
+                <w:webHidden/>
+              </w:rPr>
+            </w:r>
+            <w:r>
+              <w:rPr>
+                <w:noProof/>
+                <w:webHidden/>
+              </w:rPr>
+              <w:fldChar w:fldCharType="separate"/>
+            </w:r>
+            <w:r>
+              <w:rPr>
+                <w:noProof/>
+                <w:webHidden/>
+              </w:rPr>
+              <w:t>9</w:t>
+            </w:r>
+            <w:r>
+              <w:rPr>
+                <w:noProof/>
+                <w:webHidden/>
+              </w:rPr>
+              <w:fldChar w:fldCharType="end"/>
+            </w:r>
+          </w:hyperlink>
+        </w:p>
+        <w:p>
+          <w:pPr>
+            <w:pStyle w:val="Sumrio2"/>
+            <w:tabs>
+              <w:tab w:val="right" w:leader="dot" w:pos="9061"/>
+            </w:tabs>
+            <w:rPr>
+              <w:rFonts w:asciiTheme="minorHAnsi" w:eastAsiaTheme="minorEastAsia" w:hAnsiTheme="minorHAnsi" w:cstheme="minorBidi"/>
+              <w:noProof/>
+              <w:color w:val="auto"/>
+              <w:sz w:val="22"/>
+              <w:lang w:val="en-US"/>
+            </w:rPr>
+          </w:pPr>
+          <w:hyperlink w:anchor="_Toc230209426" w:history="1">
+            <w:r>
+              <w:rPr>
+                <w:rStyle w:val="Hyperlink"/>
+                <w:noProof/>
+              </w:rPr>
+              <w:t>O código foi organizado utilizando separação por:</w:t>
+            </w:r>
+            <w:r>
+              <w:rPr>
+                <w:noProof/>
+                <w:webHidden/>
+              </w:rPr>
+              <w:tab/>
+            </w:r>
+            <w:r>
+              <w:rPr>
+                <w:noProof/>
+                <w:webHidden/>
+              </w:rPr>
+              <w:fldChar w:fldCharType="begin"/>
+            </w:r>
+            <w:r>
+              <w:rPr>
+                <w:noProof/>
+                <w:webHidden/>
+              </w:rPr>
+              <w:instrText xml:space="preserve"> PAGEREF _Toc230209426 \h </w:instrText>
+            </w:r>
+            <w:r>
+              <w:rPr>
+                <w:noProof/>
+                <w:webHidden/>
+              </w:rPr>
+            </w:r>
+            <w:r>
+              <w:rPr>
+                <w:noProof/>
+                <w:webHidden/>
+              </w:rPr>
+              <w:fldChar w:fldCharType="separate"/>
+            </w:r>
+            <w:r>
+              <w:rPr>
+                <w:noProof/>
+                <w:webHidden/>
+              </w:rPr>
+              <w:t>9</w:t>
+            </w:r>
+            <w:r>
+              <w:rPr>
+                <w:noProof/>
+                <w:webHidden/>
+              </w:rPr>
+              <w:fldChar w:fldCharType="end"/>
+            </w:r>
+          </w:hyperlink>
+        </w:p>
+        <w:p>
+          <w:pPr>
+            <w:pStyle w:val="Sumrio2"/>
+            <w:tabs>
+              <w:tab w:val="right" w:leader="dot" w:pos="9061"/>
+            </w:tabs>
+            <w:rPr>
+              <w:rFonts w:asciiTheme="minorHAnsi" w:eastAsiaTheme="minorEastAsia" w:hAnsiTheme="minorHAnsi" w:cstheme="minorBidi"/>
+              <w:noProof/>
+              <w:color w:val="auto"/>
+              <w:sz w:val="22"/>
+              <w:lang w:val="en-US"/>
+            </w:rPr>
+          </w:pPr>
+          <w:hyperlink w:anchor="_Toc230209427" w:history="1">
+            <w:r>
+              <w:rPr>
+                <w:rStyle w:val="Hyperlink"/>
+                <w:noProof/>
+              </w:rPr>
+              <w:t>Principais recursos implementados:</w:t>
+            </w:r>
+            <w:r>
+              <w:rPr>
+                <w:noProof/>
+                <w:webHidden/>
+              </w:rPr>
+              <w:tab/>
+            </w:r>
+            <w:r>
+              <w:rPr>
+                <w:noProof/>
+                <w:webHidden/>
+              </w:rPr>
+              <w:fldChar w:fldCharType="begin"/>
+            </w:r>
+            <w:r>
+              <w:rPr>
+                <w:noProof/>
+                <w:webHidden/>
+              </w:rPr>
+              <w:instrText xml:space="preserve"> PAGEREF _Toc230209427 \h </w:instrText>
+            </w:r>
+            <w:r>
+              <w:rPr>
+                <w:noProof/>
+                <w:webHidden/>
+              </w:rPr>
+            </w:r>
+            <w:r>
+              <w:rPr>
+                <w:noProof/>
+                <w:webHidden/>
+              </w:rPr>
+              <w:fldChar w:fldCharType="separate"/>
+            </w:r>
+            <w:r>
+              <w:rPr>
+                <w:noProof/>
+                <w:webHidden/>
+              </w:rPr>
+              <w:t>9</w:t>
+            </w:r>
+            <w:r>
+              <w:rPr>
+                <w:noProof/>
+                <w:webHidden/>
+              </w:rPr>
+              <w:fldChar w:fldCharType="end"/>
+            </w:r>
+          </w:hyperlink>
+        </w:p>
+        <w:p>
+          <w:pPr>
+            <w:pStyle w:val="Sumrio2"/>
+            <w:tabs>
+              <w:tab w:val="right" w:leader="dot" w:pos="9061"/>
+            </w:tabs>
+            <w:rPr>
+              <w:rFonts w:asciiTheme="minorHAnsi" w:eastAsiaTheme="minorEastAsia" w:hAnsiTheme="minorHAnsi" w:cstheme="minorBidi"/>
+              <w:noProof/>
+              <w:color w:val="auto"/>
+              <w:sz w:val="22"/>
+              <w:lang w:val="en-US"/>
+            </w:rPr>
+          </w:pPr>
+          <w:hyperlink w:anchor="_Toc230209428" w:history="1">
+            <w:r>
+              <w:rPr>
+                <w:rStyle w:val="Hyperlink"/>
+                <w:noProof/>
+              </w:rPr>
+              <w:t>Dificuldades encontradas:</w:t>
+            </w:r>
+            <w:r>
+              <w:rPr>
+                <w:noProof/>
+                <w:webHidden/>
+              </w:rPr>
+              <w:tab/>
+            </w:r>
+            <w:r>
+              <w:rPr>
+                <w:noProof/>
+                <w:webHidden/>
+              </w:rPr>
+              <w:fldChar w:fldCharType="begin"/>
+            </w:r>
+            <w:r>
+              <w:rPr>
+                <w:noProof/>
+                <w:webHidden/>
+              </w:rPr>
+              <w:instrText xml:space="preserve"> PAGEREF _Toc230209428 \h </w:instrText>
+            </w:r>
+            <w:r>
+              <w:rPr>
+                <w:noProof/>
+                <w:webHidden/>
+              </w:rPr>
+            </w:r>
+            <w:r>
+              <w:rPr>
+                <w:noProof/>
+                <w:webHidden/>
+              </w:rPr>
+              <w:fldChar w:fldCharType="separate"/>
+            </w:r>
+            <w:r>
+              <w:rPr>
+                <w:noProof/>
+                <w:webHidden/>
+              </w:rPr>
+              <w:t>9</w:t>
+            </w:r>
+            <w:r>
+              <w:rPr>
+                <w:noProof/>
+                <w:webHidden/>
+              </w:rPr>
+              <w:fldChar w:fldCharType="end"/>
+            </w:r>
+          </w:hyperlink>
+        </w:p>
+        <w:p>
+          <w:pPr>
+            <w:ind w:firstLine="0"/>
+          </w:pPr>
           <w:r>
-            <w:rPr>
-              <w:b/>
-              <w:bCs/>
-            </w:rPr>
             <w:fldChar w:fldCharType="end"/>
           </w:r>
         </w:p>
@@ -1340,6 +2250,18 @@
     </w:p>
     <w:p>
       <w:pPr>
+        <w:jc w:val="center"/>
+        <w:rPr>
+          <w:sz w:val="28"/>
+          <w:szCs w:val="24"/>
+        </w:rPr>
+      </w:pPr>
+    </w:p>
+    <w:p>
+      <w:pPr>
+        <w:tabs>
+          <w:tab w:val="center" w:pos="4890"/>
+        </w:tabs>
         <w:rPr>
           <w:sz w:val="28"/>
           <w:szCs w:val="24"/>
@@ -1352,6 +2274,13 @@
           <w:docGrid w:linePitch="360"/>
         </w:sectPr>
       </w:pPr>
+      <w:r>
+        <w:rPr>
+          <w:sz w:val="28"/>
+          <w:szCs w:val="24"/>
+        </w:rPr>
+        <w:tab/>
+      </w:r>
     </w:p>
     <w:p>
       <w:pPr>
@@ -1365,7 +2294,7 @@
           <w:szCs w:val="24"/>
         </w:rPr>
       </w:pPr>
-      <w:bookmarkStart w:id="0" w:name="_Toc230188000"/>
+      <w:bookmarkStart w:id="0" w:name="_Toc230209402"/>
       <w:r>
         <w:rPr>
           <w:b/>
@@ -1417,7 +2346,91 @@
         <w:t xml:space="preserve"> para persistência das informações.</w:t>
       </w:r>
     </w:p>
-    <w:p/>
+    <w:p>
+      <w:pPr>
+        <w:ind w:firstLine="0"/>
+      </w:pPr>
+    </w:p>
+    <w:p>
+      <w:pPr>
+        <w:ind w:firstLine="0"/>
+        <w:jc w:val="left"/>
+        <w:outlineLvl w:val="1"/>
+      </w:pPr>
+      <w:bookmarkStart w:id="1" w:name="_Toc230209403"/>
+      <w:r>
+        <w:rPr>
+          <w:b/>
+          <w:bCs/>
+        </w:rPr>
+        <w:t>IMPLEMENTAÇÃO E PROTOTIPAGEM</w:t>
+      </w:r>
+      <w:r>
+        <w:br/>
+      </w:r>
+      <w:r>
+        <w:rPr>
+          <w:b/>
+          <w:bCs/>
+        </w:rPr>
+        <w:t>Link do Repositório:</w:t>
+      </w:r>
+      <w:bookmarkEnd w:id="1"/>
+      <w:r>
+        <w:br/>
+      </w:r>
+    </w:p>
+    <w:p>
+      <w:pPr>
+        <w:jc w:val="left"/>
+      </w:pPr>
+      <w:r>
+        <w:t>O código-fonte completo do projeto foi disponibilizado através do GitHub, contendo estrutura de pastas, arquivos do sistema, documentação e recursos utilizados durante o desenvolvimento.</w:t>
+      </w:r>
+    </w:p>
+    <w:p>
+      <w:pPr>
+        <w:ind w:firstLine="0"/>
+      </w:pPr>
+    </w:p>
+    <w:p>
+      <w:pPr>
+        <w:ind w:firstLine="0"/>
+        <w:jc w:val="left"/>
+        <w:outlineLvl w:val="1"/>
+        <w:rPr>
+          <w:b/>
+          <w:bCs/>
+        </w:rPr>
+      </w:pPr>
+      <w:bookmarkStart w:id="2" w:name="_Toc230209404"/>
+      <w:r>
+        <w:rPr>
+          <w:b/>
+          <w:bCs/>
+        </w:rPr>
+        <w:t>Repositório:</w:t>
+      </w:r>
+      <w:bookmarkEnd w:id="2"/>
+    </w:p>
+    <w:p>
+      <w:pPr>
+        <w:ind w:firstLine="0"/>
+      </w:pPr>
+      <w:hyperlink r:id="rId10" w:history="1">
+        <w:r>
+          <w:rPr>
+            <w:rStyle w:val="Hyperlink"/>
+          </w:rPr>
+          <w:t>https://github.com/desyreegarcia/playmusic</w:t>
+        </w:r>
+      </w:hyperlink>
+    </w:p>
+    <w:p>
+      <w:pPr>
+        <w:ind w:firstLine="0"/>
+      </w:pPr>
+    </w:p>
     <w:p>
       <w:pPr>
         <w:ind w:firstLine="0"/>
@@ -1430,7 +2443,7 @@
           <w:szCs w:val="24"/>
         </w:rPr>
       </w:pPr>
-      <w:bookmarkStart w:id="1" w:name="_Toc230188001"/>
+      <w:bookmarkStart w:id="3" w:name="_Toc230209405"/>
       <w:r>
         <w:rPr>
           <w:b/>
@@ -1440,7 +2453,7 @@
         </w:rPr>
         <w:t>OBJETIVO:</w:t>
       </w:r>
-      <w:bookmarkEnd w:id="1"/>
+      <w:bookmarkEnd w:id="3"/>
     </w:p>
     <w:p>
       <w:pPr>
@@ -1451,7 +2464,7 @@
           <w:bCs/>
         </w:rPr>
       </w:pPr>
-      <w:bookmarkStart w:id="2" w:name="_Toc230188002"/>
+      <w:bookmarkStart w:id="4" w:name="_Toc230209406"/>
       <w:r>
         <w:rPr>
           <w:b/>
@@ -1459,7 +2472,7 @@
         </w:rPr>
         <w:t>Objetivo Geral:</w:t>
       </w:r>
-      <w:bookmarkEnd w:id="2"/>
+      <w:bookmarkEnd w:id="4"/>
     </w:p>
     <w:p>
       <w:r>
@@ -1474,6 +2487,7 @@
           <w:bCs/>
         </w:rPr>
       </w:pPr>
+      <w:bookmarkStart w:id="5" w:name="_Toc230209407"/>
       <w:r>
         <w:rPr>
           <w:b/>
@@ -1481,6 +2495,7 @@
         </w:rPr>
         <w:t>Objetivos Específicos:</w:t>
       </w:r>
+      <w:bookmarkEnd w:id="5"/>
     </w:p>
     <w:tbl>
       <w:tblPr>
@@ -1549,6 +2564,7 @@
               </w:numPr>
             </w:pPr>
             <w:r>
+              <w:lastRenderedPageBreak/>
               <w:t xml:space="preserve">Implementar sistema de pesquisa dinâmica; </w:t>
             </w:r>
           </w:p>
@@ -1640,7 +2656,7 @@
           <w:szCs w:val="24"/>
         </w:rPr>
       </w:pPr>
-      <w:bookmarkStart w:id="3" w:name="_Toc230188003"/>
+      <w:bookmarkStart w:id="6" w:name="_Toc230209408"/>
       <w:r>
         <w:rPr>
           <w:b/>
@@ -1650,7 +2666,7 @@
         </w:rPr>
         <w:t>DESCRIÇÃO DO SISTEMA:</w:t>
       </w:r>
-      <w:bookmarkEnd w:id="3"/>
+      <w:bookmarkEnd w:id="6"/>
     </w:p>
     <w:p>
       <w:r>
@@ -1677,121 +2693,143 @@
         <w:t>O sistema possui funcionalidades que permitem:</w:t>
       </w:r>
     </w:p>
-    <w:tbl>
-      <w:tblPr>
-        <w:tblStyle w:val="Tabelacomgrade"/>
-        <w:tblW w:w="8505" w:type="dxa"/>
-        <w:tblInd w:w="-5" w:type="dxa"/>
-        <w:tblLook w:val="04A0" w:firstRow="1" w:lastRow="0" w:firstColumn="1" w:lastColumn="0" w:noHBand="0" w:noVBand="1"/>
-      </w:tblPr>
-      <w:tblGrid>
-        <w:gridCol w:w="8505"/>
-      </w:tblGrid>
-      <w:tr>
-        <w:tc>
-          <w:tcPr>
-            <w:tcW w:w="8505" w:type="dxa"/>
-          </w:tcPr>
-          <w:p>
-            <w:pPr>
-              <w:numPr>
-                <w:ilvl w:val="0"/>
-                <w:numId w:val="2"/>
-              </w:numPr>
-            </w:pPr>
-            <w:r>
-              <w:lastRenderedPageBreak/>
-              <w:t xml:space="preserve">inclusão de músicas; </w:t>
-            </w:r>
-          </w:p>
-          <w:p>
-            <w:pPr>
-              <w:numPr>
-                <w:ilvl w:val="0"/>
-                <w:numId w:val="2"/>
-              </w:numPr>
-            </w:pPr>
-            <w:r>
-              <w:t>edição de registros;</w:t>
-            </w:r>
-          </w:p>
-          <w:p>
-            <w:pPr>
-              <w:numPr>
-                <w:ilvl w:val="0"/>
-                <w:numId w:val="2"/>
-              </w:numPr>
-            </w:pPr>
-            <w:r>
-              <w:t>exclusão de músicas;</w:t>
-            </w:r>
-          </w:p>
-          <w:p>
-            <w:pPr>
-              <w:numPr>
-                <w:ilvl w:val="0"/>
-                <w:numId w:val="2"/>
-              </w:numPr>
-            </w:pPr>
-            <w:r>
-              <w:t>pesquisa rápida;</w:t>
-            </w:r>
-          </w:p>
-          <w:p>
-            <w:pPr>
-              <w:numPr>
-                <w:ilvl w:val="0"/>
-                <w:numId w:val="2"/>
-              </w:numPr>
-            </w:pPr>
-            <w:r>
-              <w:t>filtro por gênero;</w:t>
-            </w:r>
-          </w:p>
-          <w:p>
-            <w:pPr>
-              <w:numPr>
-                <w:ilvl w:val="0"/>
-                <w:numId w:val="2"/>
-              </w:numPr>
-            </w:pPr>
-            <w:r>
-              <w:t>visualização de estatísticas;</w:t>
-            </w:r>
-          </w:p>
-          <w:p>
-            <w:pPr>
-              <w:numPr>
-                <w:ilvl w:val="0"/>
-                <w:numId w:val="2"/>
-              </w:numPr>
-            </w:pPr>
-            <w:r>
-              <w:t>gerenciamento das preferências do aplicativo.</w:t>
-            </w:r>
-          </w:p>
-          <w:p>
-            <w:pPr>
-              <w:numPr>
-                <w:ilvl w:val="0"/>
-                <w:numId w:val="2"/>
-              </w:numPr>
-            </w:pPr>
-            <w:r>
-              <w:t xml:space="preserve">Os dados são armazenados localmente através do banco </w:t>
-            </w:r>
-            <w:proofErr w:type="spellStart"/>
-            <w:r>
-              <w:t>SQLite</w:t>
-            </w:r>
-            <w:proofErr w:type="spellEnd"/>
-            <w:r>
-              <w:t>, garantindo persistência das informações entre execuções do sistema.</w:t>
-            </w:r>
-          </w:p>
-        </w:tc>
-      </w:tr>
-    </w:tbl>
+    <w:p>
+      <w:pPr>
+        <w:numPr>
+          <w:ilvl w:val="0"/>
+          <w:numId w:val="2"/>
+        </w:numPr>
+        <w:tabs>
+          <w:tab w:val="clear" w:pos="720"/>
+          <w:tab w:val="num" w:pos="0"/>
+        </w:tabs>
+        <w:ind w:left="0" w:firstLine="0"/>
+      </w:pPr>
+      <w:r>
+        <w:t xml:space="preserve">inclusão de músicas; </w:t>
+      </w:r>
+    </w:p>
+    <w:p>
+      <w:pPr>
+        <w:numPr>
+          <w:ilvl w:val="0"/>
+          <w:numId w:val="2"/>
+        </w:numPr>
+        <w:tabs>
+          <w:tab w:val="clear" w:pos="720"/>
+          <w:tab w:val="num" w:pos="0"/>
+        </w:tabs>
+        <w:ind w:left="0" w:firstLine="0"/>
+      </w:pPr>
+      <w:r>
+        <w:t>edição de registros;</w:t>
+      </w:r>
+    </w:p>
+    <w:p>
+      <w:pPr>
+        <w:numPr>
+          <w:ilvl w:val="0"/>
+          <w:numId w:val="2"/>
+        </w:numPr>
+        <w:tabs>
+          <w:tab w:val="clear" w:pos="720"/>
+          <w:tab w:val="num" w:pos="0"/>
+        </w:tabs>
+        <w:ind w:left="0" w:firstLine="0"/>
+      </w:pPr>
+      <w:r>
+        <w:t>exclusão de músicas;</w:t>
+      </w:r>
+    </w:p>
+    <w:p>
+      <w:pPr>
+        <w:numPr>
+          <w:ilvl w:val="0"/>
+          <w:numId w:val="2"/>
+        </w:numPr>
+        <w:tabs>
+          <w:tab w:val="clear" w:pos="720"/>
+          <w:tab w:val="num" w:pos="0"/>
+        </w:tabs>
+        <w:ind w:left="0" w:firstLine="0"/>
+      </w:pPr>
+      <w:r>
+        <w:t>pesquisa rápida;</w:t>
+      </w:r>
+    </w:p>
+    <w:p>
+      <w:pPr>
+        <w:numPr>
+          <w:ilvl w:val="0"/>
+          <w:numId w:val="2"/>
+        </w:numPr>
+        <w:tabs>
+          <w:tab w:val="clear" w:pos="720"/>
+          <w:tab w:val="num" w:pos="0"/>
+        </w:tabs>
+        <w:ind w:left="0" w:firstLine="0"/>
+      </w:pPr>
+      <w:r>
+        <w:t>filtro por gênero;</w:t>
+      </w:r>
+    </w:p>
+    <w:p>
+      <w:pPr>
+        <w:numPr>
+          <w:ilvl w:val="0"/>
+          <w:numId w:val="2"/>
+        </w:numPr>
+        <w:tabs>
+          <w:tab w:val="clear" w:pos="720"/>
+          <w:tab w:val="num" w:pos="0"/>
+        </w:tabs>
+        <w:ind w:left="0" w:firstLine="0"/>
+      </w:pPr>
+      <w:r>
+        <w:t>visualização de estatísticas;</w:t>
+      </w:r>
+    </w:p>
+    <w:p>
+      <w:pPr>
+        <w:numPr>
+          <w:ilvl w:val="0"/>
+          <w:numId w:val="2"/>
+        </w:numPr>
+        <w:tabs>
+          <w:tab w:val="clear" w:pos="720"/>
+          <w:tab w:val="num" w:pos="0"/>
+        </w:tabs>
+        <w:ind w:left="0" w:firstLine="0"/>
+      </w:pPr>
+      <w:r>
+        <w:t>gerenciamento das preferências do aplicativo.</w:t>
+      </w:r>
+    </w:p>
+    <w:p>
+      <w:pPr>
+        <w:pStyle w:val="PargrafodaLista"/>
+        <w:numPr>
+          <w:ilvl w:val="0"/>
+          <w:numId w:val="2"/>
+        </w:numPr>
+        <w:tabs>
+          <w:tab w:val="clear" w:pos="720"/>
+          <w:tab w:val="num" w:pos="0"/>
+        </w:tabs>
+        <w:ind w:left="0" w:firstLine="0"/>
+      </w:pPr>
+      <w:r>
+        <w:t xml:space="preserve">Os dados são armazenados localmente através do banco </w:t>
+      </w:r>
+      <w:proofErr w:type="spellStart"/>
+      <w:r>
+        <w:t>SQLite</w:t>
+      </w:r>
+      <w:proofErr w:type="spellEnd"/>
+      <w:r>
+        <w:t>, garantindo persistência das informações entre execuções do sistema.</w:t>
+      </w:r>
+    </w:p>
     <w:p/>
     <w:p>
       <w:pPr>
@@ -1804,7 +2842,7 @@
           <w:szCs w:val="24"/>
         </w:rPr>
       </w:pPr>
-      <w:bookmarkStart w:id="4" w:name="_Toc230188004"/>
+      <w:bookmarkStart w:id="7" w:name="_Toc230209409"/>
       <w:r>
         <w:rPr>
           <w:b/>
@@ -1814,7 +2852,7 @@
         </w:rPr>
         <w:t>TECNOLOGIAS UTILIZADAS:</w:t>
       </w:r>
-      <w:bookmarkEnd w:id="4"/>
+      <w:bookmarkEnd w:id="7"/>
     </w:p>
     <w:p>
       <w:pPr>
@@ -2121,7 +3159,7 @@
           <w:szCs w:val="24"/>
         </w:rPr>
       </w:pPr>
-      <w:bookmarkStart w:id="5" w:name="_Toc230188005"/>
+      <w:bookmarkStart w:id="8" w:name="_Toc230209410"/>
       <w:r>
         <w:rPr>
           <w:b/>
@@ -2129,168 +3167,151 @@
           <w:sz w:val="28"/>
           <w:szCs w:val="24"/>
         </w:rPr>
+        <w:lastRenderedPageBreak/>
         <w:t>FUNCIONALIDADES IMPLEMENTADAS:</w:t>
       </w:r>
-      <w:bookmarkEnd w:id="5"/>
+      <w:bookmarkEnd w:id="8"/>
     </w:p>
     <w:p>
       <w:r>
         <w:t>O sistema possui os seguintes recursos:</w:t>
       </w:r>
     </w:p>
-    <w:tbl>
-      <w:tblPr>
-        <w:tblStyle w:val="Tabelacomgrade"/>
-        <w:tblW w:w="0" w:type="auto"/>
-        <w:tblLook w:val="04A0" w:firstRow="1" w:lastRow="0" w:firstColumn="1" w:lastColumn="0" w:noHBand="0" w:noVBand="1"/>
-      </w:tblPr>
-      <w:tblGrid>
-        <w:gridCol w:w="8494"/>
-      </w:tblGrid>
-      <w:tr>
-        <w:tc>
-          <w:tcPr>
-            <w:tcW w:w="8494" w:type="dxa"/>
-          </w:tcPr>
-          <w:p>
-            <w:pPr>
-              <w:pStyle w:val="PargrafodaLista"/>
-              <w:numPr>
-                <w:ilvl w:val="0"/>
-                <w:numId w:val="3"/>
-              </w:numPr>
-              <w:ind w:left="0" w:firstLine="0"/>
-            </w:pPr>
-            <w:r>
-              <w:t>Cadastro de músicas</w:t>
-            </w:r>
-          </w:p>
-          <w:p>
-            <w:pPr>
-              <w:pStyle w:val="PargrafodaLista"/>
-              <w:numPr>
-                <w:ilvl w:val="0"/>
-                <w:numId w:val="3"/>
-              </w:numPr>
-              <w:ind w:left="0" w:firstLine="0"/>
-            </w:pPr>
-            <w:r>
-              <w:t>Edição</w:t>
-            </w:r>
-          </w:p>
-          <w:p>
-            <w:pPr>
-              <w:pStyle w:val="PargrafodaLista"/>
-              <w:numPr>
-                <w:ilvl w:val="0"/>
-                <w:numId w:val="3"/>
-              </w:numPr>
-              <w:ind w:left="0" w:firstLine="0"/>
-            </w:pPr>
-            <w:r>
-              <w:t>Exclusão</w:t>
-            </w:r>
-          </w:p>
-          <w:p>
-            <w:pPr>
-              <w:pStyle w:val="PargrafodaLista"/>
-              <w:numPr>
-                <w:ilvl w:val="0"/>
-                <w:numId w:val="3"/>
-              </w:numPr>
-              <w:ind w:left="0" w:firstLine="0"/>
-            </w:pPr>
-            <w:r>
-              <w:t>Pesquisa</w:t>
-            </w:r>
-          </w:p>
-          <w:p>
-            <w:pPr>
-              <w:pStyle w:val="PargrafodaLista"/>
-              <w:numPr>
-                <w:ilvl w:val="0"/>
-                <w:numId w:val="3"/>
-              </w:numPr>
-              <w:ind w:left="0" w:firstLine="0"/>
-            </w:pPr>
-            <w:r>
-              <w:t>Filtro por gênero</w:t>
-            </w:r>
-          </w:p>
-          <w:p>
-            <w:pPr>
-              <w:pStyle w:val="PargrafodaLista"/>
-              <w:numPr>
-                <w:ilvl w:val="0"/>
-                <w:numId w:val="3"/>
-              </w:numPr>
-              <w:ind w:left="0" w:firstLine="0"/>
-            </w:pPr>
-            <w:r>
-              <w:t>Dashboard</w:t>
-            </w:r>
-          </w:p>
-          <w:p>
-            <w:pPr>
-              <w:pStyle w:val="PargrafodaLista"/>
-              <w:numPr>
-                <w:ilvl w:val="0"/>
-                <w:numId w:val="3"/>
-              </w:numPr>
-              <w:ind w:left="0" w:firstLine="0"/>
-            </w:pPr>
-            <w:r>
-              <w:t>Estatísticas</w:t>
-            </w:r>
-          </w:p>
-          <w:p>
-            <w:pPr>
-              <w:pStyle w:val="PargrafodaLista"/>
-              <w:numPr>
-                <w:ilvl w:val="0"/>
-                <w:numId w:val="3"/>
-              </w:numPr>
-              <w:ind w:left="0" w:firstLine="0"/>
-            </w:pPr>
-            <w:r>
-              <w:t>Tema claro/escuro</w:t>
-            </w:r>
-          </w:p>
-          <w:p>
-            <w:pPr>
-              <w:pStyle w:val="PargrafodaLista"/>
-              <w:numPr>
-                <w:ilvl w:val="0"/>
-                <w:numId w:val="3"/>
-              </w:numPr>
-              <w:ind w:left="0" w:firstLine="0"/>
-            </w:pPr>
-            <w:r>
-              <w:lastRenderedPageBreak/>
-              <w:t xml:space="preserve">Persistência </w:t>
-            </w:r>
-            <w:proofErr w:type="spellStart"/>
-            <w:r>
-              <w:t>SQLite</w:t>
-            </w:r>
-            <w:proofErr w:type="spellEnd"/>
-          </w:p>
-          <w:p>
-            <w:pPr>
-              <w:pStyle w:val="PargrafodaLista"/>
-              <w:numPr>
-                <w:ilvl w:val="0"/>
-                <w:numId w:val="3"/>
-              </w:numPr>
-              <w:ind w:left="0" w:firstLine="0"/>
-            </w:pPr>
-            <w:r>
-              <w:t>Tela Sobre</w:t>
-            </w:r>
-          </w:p>
-        </w:tc>
-      </w:tr>
-    </w:tbl>
+    <w:p>
+      <w:pPr>
+        <w:pStyle w:val="PargrafodaLista"/>
+        <w:numPr>
+          <w:ilvl w:val="0"/>
+          <w:numId w:val="3"/>
+        </w:numPr>
+        <w:ind w:left="0" w:firstLine="0"/>
+      </w:pPr>
+      <w:r>
+        <w:t>Cadastro de músicas</w:t>
+      </w:r>
+    </w:p>
+    <w:p>
+      <w:pPr>
+        <w:pStyle w:val="PargrafodaLista"/>
+        <w:numPr>
+          <w:ilvl w:val="0"/>
+          <w:numId w:val="3"/>
+        </w:numPr>
+        <w:ind w:left="0" w:firstLine="0"/>
+      </w:pPr>
+      <w:r>
+        <w:t>Edição</w:t>
+      </w:r>
+    </w:p>
+    <w:p>
+      <w:pPr>
+        <w:pStyle w:val="PargrafodaLista"/>
+        <w:numPr>
+          <w:ilvl w:val="0"/>
+          <w:numId w:val="3"/>
+        </w:numPr>
+        <w:ind w:left="0" w:firstLine="0"/>
+      </w:pPr>
+      <w:r>
+        <w:t>Exclusão</w:t>
+      </w:r>
+    </w:p>
+    <w:p>
+      <w:pPr>
+        <w:pStyle w:val="PargrafodaLista"/>
+        <w:numPr>
+          <w:ilvl w:val="0"/>
+          <w:numId w:val="3"/>
+        </w:numPr>
+        <w:ind w:left="0" w:firstLine="0"/>
+      </w:pPr>
+      <w:r>
+        <w:t>Pesquisa</w:t>
+      </w:r>
+    </w:p>
+    <w:p>
+      <w:pPr>
+        <w:pStyle w:val="PargrafodaLista"/>
+        <w:numPr>
+          <w:ilvl w:val="0"/>
+          <w:numId w:val="3"/>
+        </w:numPr>
+        <w:ind w:left="0" w:firstLine="0"/>
+      </w:pPr>
+      <w:r>
+        <w:t>Filtro por gênero</w:t>
+      </w:r>
+    </w:p>
+    <w:p>
+      <w:pPr>
+        <w:pStyle w:val="PargrafodaLista"/>
+        <w:numPr>
+          <w:ilvl w:val="0"/>
+          <w:numId w:val="3"/>
+        </w:numPr>
+        <w:ind w:left="0" w:firstLine="0"/>
+      </w:pPr>
+      <w:r>
+        <w:t>Dashboard</w:t>
+      </w:r>
+    </w:p>
+    <w:p>
+      <w:pPr>
+        <w:pStyle w:val="PargrafodaLista"/>
+        <w:numPr>
+          <w:ilvl w:val="0"/>
+          <w:numId w:val="3"/>
+        </w:numPr>
+        <w:ind w:left="0" w:firstLine="0"/>
+      </w:pPr>
+      <w:r>
+        <w:t>Estatísticas</w:t>
+      </w:r>
+    </w:p>
+    <w:p>
+      <w:pPr>
+        <w:pStyle w:val="PargrafodaLista"/>
+        <w:numPr>
+          <w:ilvl w:val="0"/>
+          <w:numId w:val="3"/>
+        </w:numPr>
+        <w:ind w:left="0" w:firstLine="0"/>
+      </w:pPr>
+      <w:r>
+        <w:t>Tema claro/escuro</w:t>
+      </w:r>
+    </w:p>
+    <w:p>
+      <w:pPr>
+        <w:pStyle w:val="PargrafodaLista"/>
+        <w:numPr>
+          <w:ilvl w:val="0"/>
+          <w:numId w:val="3"/>
+        </w:numPr>
+        <w:ind w:left="0" w:firstLine="0"/>
+      </w:pPr>
+      <w:r>
+        <w:t xml:space="preserve">Persistência </w:t>
+      </w:r>
+      <w:proofErr w:type="spellStart"/>
+      <w:r>
+        <w:t>SQLite</w:t>
+      </w:r>
+      <w:proofErr w:type="spellEnd"/>
+    </w:p>
+    <w:p>
+      <w:pPr>
+        <w:pStyle w:val="PargrafodaLista"/>
+        <w:numPr>
+          <w:ilvl w:val="0"/>
+          <w:numId w:val="3"/>
+        </w:numPr>
+        <w:ind w:left="0" w:firstLine="0"/>
+      </w:pPr>
+      <w:r>
+        <w:t>Tela Sobre</w:t>
+      </w:r>
+    </w:p>
     <w:p>
       <w:pPr>
         <w:ind w:firstLine="0"/>
@@ -2308,7 +3329,7 @@
           <w:szCs w:val="24"/>
         </w:rPr>
       </w:pPr>
-      <w:bookmarkStart w:id="6" w:name="_Toc230188006"/>
+      <w:bookmarkStart w:id="9" w:name="_Toc230209411"/>
       <w:r>
         <w:rPr>
           <w:b/>
@@ -2318,7 +3339,7 @@
         </w:rPr>
         <w:t>DEMONSTRAÇÃO DO SISTEMA:</w:t>
       </w:r>
-      <w:bookmarkEnd w:id="6"/>
+      <w:bookmarkEnd w:id="9"/>
     </w:p>
     <w:p>
       <w:pPr>
@@ -2330,7 +3351,7 @@
           <w:bCs/>
         </w:rPr>
       </w:pPr>
-      <w:bookmarkStart w:id="7" w:name="_Toc230188007"/>
+      <w:bookmarkStart w:id="10" w:name="_Toc230209412"/>
       <w:r>
         <w:rPr>
           <w:b/>
@@ -2338,7 +3359,7 @@
         </w:rPr>
         <w:t>Dashboard:</w:t>
       </w:r>
-      <w:bookmarkEnd w:id="7"/>
+      <w:bookmarkEnd w:id="10"/>
     </w:p>
     <w:p>
       <w:pPr>
@@ -2362,115 +3383,6 @@
                 <pic:pic xmlns:pic="http://schemas.openxmlformats.org/drawingml/2006/picture">
                   <pic:nvPicPr>
                     <pic:cNvPr id="0" name="Picture 1"/>
-                    <pic:cNvPicPr>
-                      <a:picLocks noChangeAspect="1" noChangeArrowheads="1"/>
-                    </pic:cNvPicPr>
-                  </pic:nvPicPr>
-                  <pic:blipFill>
-                    <a:blip r:embed="rId10" cstate="print">
-                      <a:extLst>
-                        <a:ext uri="{28A0092B-C50C-407E-A947-70E740481C1C}">
-                          <a14:useLocalDpi xmlns:a14="http://schemas.microsoft.com/office/drawing/2010/main" val="0"/>
-                        </a:ext>
-                      </a:extLst>
-                    </a:blip>
-                    <a:srcRect/>
-                    <a:stretch>
-                      <a:fillRect/>
-                    </a:stretch>
-                  </pic:blipFill>
-                  <pic:spPr bwMode="auto">
-                    <a:xfrm>
-                      <a:off x="0" y="0"/>
-                      <a:ext cx="5400040" cy="2902585"/>
-                    </a:xfrm>
-                    <a:prstGeom prst="rect">
-                      <a:avLst/>
-                    </a:prstGeom>
-                    <a:noFill/>
-                    <a:ln>
-                      <a:noFill/>
-                    </a:ln>
-                  </pic:spPr>
-                </pic:pic>
-              </a:graphicData>
-            </a:graphic>
-          </wp:inline>
-        </w:drawing>
-      </w:r>
-    </w:p>
-    <w:p/>
-    <w:p>
-      <w:pPr>
-        <w:ind w:firstLine="0"/>
-        <w:jc w:val="center"/>
-      </w:pPr>
-      <w:r>
-        <w:t>Tela principal contendo indicadores, pesquisa e listagem das músicas cadastradas.</w:t>
-      </w:r>
-    </w:p>
-    <w:p>
-      <w:pPr>
-        <w:spacing w:after="160" w:line="259" w:lineRule="auto"/>
-        <w:ind w:firstLine="0"/>
-        <w:jc w:val="left"/>
-      </w:pPr>
-      <w:r>
-        <w:br w:type="page"/>
-      </w:r>
-    </w:p>
-    <w:p>
-      <w:pPr>
-        <w:ind w:firstLine="0"/>
-        <w:jc w:val="left"/>
-        <w:outlineLvl w:val="0"/>
-        <w:rPr>
-          <w:b/>
-          <w:bCs/>
-        </w:rPr>
-      </w:pPr>
-    </w:p>
-    <w:p>
-      <w:pPr>
-        <w:ind w:firstLine="708"/>
-        <w:jc w:val="left"/>
-        <w:outlineLvl w:val="1"/>
-        <w:rPr>
-          <w:b/>
-          <w:bCs/>
-        </w:rPr>
-      </w:pPr>
-      <w:bookmarkStart w:id="8" w:name="_Toc230188008"/>
-      <w:r>
-        <w:rPr>
-          <w:b/>
-          <w:bCs/>
-        </w:rPr>
-        <w:t>Cadastro:</w:t>
-      </w:r>
-      <w:bookmarkEnd w:id="8"/>
-    </w:p>
-    <w:p>
-      <w:pPr>
-        <w:ind w:firstLine="0"/>
-      </w:pPr>
-      <w:r>
-        <w:rPr>
-          <w:noProof/>
-        </w:rPr>
-        <w:drawing>
-          <wp:inline distT="0" distB="0" distL="0" distR="0" wp14:anchorId="31410C68" wp14:editId="00CDA924">
-            <wp:extent cx="5400040" cy="2902585"/>
-            <wp:effectExtent l="0" t="0" r="0" b="0"/>
-            <wp:docPr id="840926788" name="Imagem 2"/>
-            <wp:cNvGraphicFramePr>
-              <a:graphicFrameLocks xmlns:a="http://schemas.openxmlformats.org/drawingml/2006/main" noChangeAspect="1"/>
-            </wp:cNvGraphicFramePr>
-            <a:graphic xmlns:a="http://schemas.openxmlformats.org/drawingml/2006/main">
-              <a:graphicData uri="http://schemas.openxmlformats.org/drawingml/2006/picture">
-                <pic:pic xmlns:pic="http://schemas.openxmlformats.org/drawingml/2006/picture">
-                  <pic:nvPicPr>
-                    <pic:cNvPr id="0" name="Picture 3"/>
                     <pic:cNvPicPr>
                       <a:picLocks noChangeAspect="1" noChangeArrowheads="1"/>
                     </pic:cNvPicPr>
@@ -2508,59 +3420,70 @@
         </w:drawing>
       </w:r>
     </w:p>
+    <w:p/>
     <w:p>
       <w:pPr>
         <w:ind w:firstLine="0"/>
         <w:jc w:val="center"/>
       </w:pPr>
-    </w:p>
-    <w:p>
-      <w:pPr>
+      <w:r>
+        <w:t>Tela principal contendo indicadores, pesquisa e listagem das músicas cadastradas.</w:t>
+      </w:r>
+    </w:p>
+    <w:p>
+      <w:pPr>
+        <w:spacing w:after="160" w:line="259" w:lineRule="auto"/>
         <w:ind w:firstLine="0"/>
-        <w:jc w:val="center"/>
-      </w:pPr>
-      <w:r>
-        <w:t>Tela destinada ao cadastro de novos registros.</w:t>
+        <w:jc w:val="left"/>
+      </w:pPr>
+      <w:r>
+        <w:br w:type="page"/>
       </w:r>
     </w:p>
     <w:p>
       <w:pPr>
         <w:ind w:firstLine="0"/>
+        <w:jc w:val="left"/>
+        <w:outlineLvl w:val="0"/>
+        <w:rPr>
+          <w:b/>
+          <w:bCs/>
+        </w:rPr>
       </w:pPr>
     </w:p>
     <w:p>
       <w:pPr>
         <w:ind w:firstLine="708"/>
+        <w:jc w:val="left"/>
         <w:outlineLvl w:val="1"/>
         <w:rPr>
           <w:b/>
           <w:bCs/>
         </w:rPr>
       </w:pPr>
-      <w:bookmarkStart w:id="9" w:name="_Toc230188009"/>
-      <w:r>
-        <w:rPr>
-          <w:b/>
-          <w:bCs/>
-        </w:rPr>
-        <w:t>Pesquisa e Filtro:</w:t>
-      </w:r>
-      <w:bookmarkEnd w:id="9"/>
+      <w:bookmarkStart w:id="11" w:name="_Toc230209413"/>
+      <w:r>
+        <w:rPr>
+          <w:b/>
+          <w:bCs/>
+        </w:rPr>
+        <w:t>Cadastro:</w:t>
+      </w:r>
+      <w:bookmarkEnd w:id="11"/>
     </w:p>
     <w:p>
       <w:pPr>
         <w:ind w:firstLine="0"/>
-        <w:jc w:val="center"/>
       </w:pPr>
       <w:r>
         <w:rPr>
           <w:noProof/>
         </w:rPr>
         <w:drawing>
-          <wp:inline distT="0" distB="0" distL="0" distR="0" wp14:anchorId="7563F97D" wp14:editId="0263563B">
+          <wp:inline distT="0" distB="0" distL="0" distR="0" wp14:anchorId="31410C68" wp14:editId="00CDA924">
             <wp:extent cx="5400040" cy="2902585"/>
             <wp:effectExtent l="0" t="0" r="0" b="0"/>
-            <wp:docPr id="1797249045" name="Imagem 3"/>
+            <wp:docPr id="840926788" name="Imagem 2"/>
             <wp:cNvGraphicFramePr>
               <a:graphicFrameLocks xmlns:a="http://schemas.openxmlformats.org/drawingml/2006/main" noChangeAspect="1"/>
             </wp:cNvGraphicFramePr>
@@ -2568,7 +3491,7 @@
               <a:graphicData uri="http://schemas.openxmlformats.org/drawingml/2006/picture">
                 <pic:pic xmlns:pic="http://schemas.openxmlformats.org/drawingml/2006/picture">
                   <pic:nvPicPr>
-                    <pic:cNvPr id="0" name="Picture 5"/>
+                    <pic:cNvPr id="0" name="Picture 3"/>
                     <pic:cNvPicPr>
                       <a:picLocks noChangeAspect="1" noChangeArrowheads="1"/>
                     </pic:cNvPicPr>
@@ -2606,36 +3529,11 @@
         </w:drawing>
       </w:r>
     </w:p>
-    <w:p/>
     <w:p>
       <w:pPr>
         <w:ind w:firstLine="0"/>
         <w:jc w:val="center"/>
       </w:pPr>
-      <w:r>
-        <w:t>Permite localizar músicas através de pesquisa dinâmica e filtro por gênero.</w:t>
-      </w:r>
-    </w:p>
-    <w:p/>
-    <w:p>
-      <w:pPr>
-        <w:ind w:firstLine="708"/>
-        <w:jc w:val="left"/>
-        <w:outlineLvl w:val="1"/>
-        <w:rPr>
-          <w:b/>
-          <w:bCs/>
-        </w:rPr>
-      </w:pPr>
-      <w:bookmarkStart w:id="10" w:name="_Toc230188010"/>
-      <w:r>
-        <w:rPr>
-          <w:b/>
-          <w:bCs/>
-        </w:rPr>
-        <w:t>Estatísticas:</w:t>
-      </w:r>
-      <w:bookmarkEnd w:id="10"/>
     </w:p>
     <w:p>
       <w:pPr>
@@ -2643,14 +3541,47 @@
         <w:jc w:val="center"/>
       </w:pPr>
       <w:r>
+        <w:t>Tela destinada ao cadastro de novos registros.</w:t>
+      </w:r>
+    </w:p>
+    <w:p>
+      <w:pPr>
+        <w:ind w:firstLine="0"/>
+      </w:pPr>
+    </w:p>
+    <w:p>
+      <w:pPr>
+        <w:ind w:firstLine="708"/>
+        <w:outlineLvl w:val="1"/>
+        <w:rPr>
+          <w:b/>
+          <w:bCs/>
+        </w:rPr>
+      </w:pPr>
+      <w:bookmarkStart w:id="12" w:name="_Toc230209414"/>
+      <w:r>
+        <w:rPr>
+          <w:b/>
+          <w:bCs/>
+        </w:rPr>
+        <w:t>Pesquisa e Filtro:</w:t>
+      </w:r>
+      <w:bookmarkEnd w:id="12"/>
+    </w:p>
+    <w:p>
+      <w:pPr>
+        <w:ind w:firstLine="0"/>
+        <w:jc w:val="center"/>
+      </w:pPr>
+      <w:r>
         <w:rPr>
           <w:noProof/>
         </w:rPr>
         <w:drawing>
-          <wp:inline distT="0" distB="0" distL="0" distR="0" wp14:anchorId="662D4FD1" wp14:editId="4ABFD6B8">
+          <wp:inline distT="0" distB="0" distL="0" distR="0" wp14:anchorId="7563F97D" wp14:editId="0263563B">
             <wp:extent cx="5400040" cy="2902585"/>
             <wp:effectExtent l="0" t="0" r="0" b="0"/>
-            <wp:docPr id="1511156854" name="Imagem 4"/>
+            <wp:docPr id="1797249045" name="Imagem 3"/>
             <wp:cNvGraphicFramePr>
               <a:graphicFrameLocks xmlns:a="http://schemas.openxmlformats.org/drawingml/2006/main" noChangeAspect="1"/>
             </wp:cNvGraphicFramePr>
@@ -2658,7 +3589,7 @@
               <a:graphicData uri="http://schemas.openxmlformats.org/drawingml/2006/picture">
                 <pic:pic xmlns:pic="http://schemas.openxmlformats.org/drawingml/2006/picture">
                   <pic:nvPicPr>
-                    <pic:cNvPr id="0" name="Picture 7"/>
+                    <pic:cNvPr id="0" name="Picture 5"/>
                     <pic:cNvPicPr>
                       <a:picLocks noChangeAspect="1" noChangeArrowheads="1"/>
                     </pic:cNvPicPr>
@@ -2703,48 +3634,44 @@
         <w:jc w:val="center"/>
       </w:pPr>
       <w:r>
-        <w:t>Apresenta indicadores gerais do sistema.</w:t>
-      </w:r>
+        <w:t>Permite localizar músicas através de pesquisa dinâmica e filtro por gênero.</w:t>
+      </w:r>
+    </w:p>
+    <w:p/>
+    <w:p>
+      <w:pPr>
+        <w:ind w:firstLine="708"/>
+        <w:jc w:val="left"/>
+        <w:outlineLvl w:val="1"/>
+        <w:rPr>
+          <w:b/>
+          <w:bCs/>
+        </w:rPr>
+      </w:pPr>
+      <w:bookmarkStart w:id="13" w:name="_Toc230209415"/>
+      <w:r>
+        <w:rPr>
+          <w:b/>
+          <w:bCs/>
+        </w:rPr>
+        <w:t>Estatísticas:</w:t>
+      </w:r>
+      <w:bookmarkEnd w:id="13"/>
     </w:p>
     <w:p>
       <w:pPr>
         <w:ind w:firstLine="0"/>
         <w:jc w:val="center"/>
       </w:pPr>
-    </w:p>
-    <w:p>
-      <w:pPr>
-        <w:ind w:firstLine="708"/>
-        <w:outlineLvl w:val="1"/>
-        <w:rPr>
-          <w:b/>
-          <w:bCs/>
-        </w:rPr>
-      </w:pPr>
-      <w:bookmarkStart w:id="11" w:name="_Toc230188011"/>
-      <w:r>
-        <w:rPr>
-          <w:b/>
-          <w:bCs/>
-        </w:rPr>
-        <w:t>Tema Escuro:</w:t>
-      </w:r>
-      <w:bookmarkEnd w:id="11"/>
-    </w:p>
-    <w:p>
-      <w:pPr>
-        <w:ind w:firstLine="0"/>
-        <w:jc w:val="center"/>
-      </w:pPr>
       <w:r>
         <w:rPr>
           <w:noProof/>
         </w:rPr>
         <w:drawing>
-          <wp:inline distT="0" distB="0" distL="0" distR="0" wp14:anchorId="555DFE0C" wp14:editId="5D3B7B6A">
+          <wp:inline distT="0" distB="0" distL="0" distR="0" wp14:anchorId="662D4FD1" wp14:editId="4ABFD6B8">
             <wp:extent cx="5400040" cy="2902585"/>
             <wp:effectExtent l="0" t="0" r="0" b="0"/>
-            <wp:docPr id="642588132" name="Imagem 5"/>
+            <wp:docPr id="1511156854" name="Imagem 4"/>
             <wp:cNvGraphicFramePr>
               <a:graphicFrameLocks xmlns:a="http://schemas.openxmlformats.org/drawingml/2006/main" noChangeAspect="1"/>
             </wp:cNvGraphicFramePr>
@@ -2752,7 +3679,7 @@
               <a:graphicData uri="http://schemas.openxmlformats.org/drawingml/2006/picture">
                 <pic:pic xmlns:pic="http://schemas.openxmlformats.org/drawingml/2006/picture">
                   <pic:nvPicPr>
-                    <pic:cNvPr id="0" name="Picture 9"/>
+                    <pic:cNvPr id="0" name="Picture 7"/>
                     <pic:cNvPicPr>
                       <a:picLocks noChangeAspect="1" noChangeArrowheads="1"/>
                     </pic:cNvPicPr>
@@ -2797,44 +3724,48 @@
         <w:jc w:val="center"/>
       </w:pPr>
       <w:r>
-        <w:t>Permite alternância entre os temas visuais do aplicativo.</w:t>
-      </w:r>
-    </w:p>
-    <w:p>
-      <w:pPr>
-        <w:ind w:firstLine="708"/>
-        <w:jc w:val="left"/>
-        <w:outlineLvl w:val="1"/>
-        <w:rPr>
-          <w:b/>
-          <w:bCs/>
-        </w:rPr>
-      </w:pPr>
-      <w:bookmarkStart w:id="12" w:name="_Toc230188012"/>
-      <w:r>
-        <w:rPr>
-          <w:b/>
-          <w:bCs/>
-        </w:rPr>
-        <w:lastRenderedPageBreak/>
-        <w:t>Sobre:</w:t>
-      </w:r>
-      <w:bookmarkEnd w:id="12"/>
+        <w:t>Apresenta indicadores gerais do sistema.</w:t>
+      </w:r>
     </w:p>
     <w:p>
       <w:pPr>
         <w:ind w:firstLine="0"/>
         <w:jc w:val="center"/>
       </w:pPr>
+    </w:p>
+    <w:p>
+      <w:pPr>
+        <w:ind w:firstLine="708"/>
+        <w:outlineLvl w:val="1"/>
+        <w:rPr>
+          <w:b/>
+          <w:bCs/>
+        </w:rPr>
+      </w:pPr>
+      <w:bookmarkStart w:id="14" w:name="_Toc230209416"/>
+      <w:r>
+        <w:rPr>
+          <w:b/>
+          <w:bCs/>
+        </w:rPr>
+        <w:t>Tema Escuro:</w:t>
+      </w:r>
+      <w:bookmarkEnd w:id="14"/>
+    </w:p>
+    <w:p>
+      <w:pPr>
+        <w:ind w:firstLine="0"/>
+        <w:jc w:val="center"/>
+      </w:pPr>
       <w:r>
         <w:rPr>
           <w:noProof/>
         </w:rPr>
         <w:drawing>
-          <wp:inline distT="0" distB="0" distL="0" distR="0" wp14:anchorId="70341634" wp14:editId="67EF7D04">
+          <wp:inline distT="0" distB="0" distL="0" distR="0" wp14:anchorId="555DFE0C" wp14:editId="5D3B7B6A">
             <wp:extent cx="5400040" cy="2902585"/>
             <wp:effectExtent l="0" t="0" r="0" b="0"/>
-            <wp:docPr id="581160763" name="Imagem 6"/>
+            <wp:docPr id="642588132" name="Imagem 5"/>
             <wp:cNvGraphicFramePr>
               <a:graphicFrameLocks xmlns:a="http://schemas.openxmlformats.org/drawingml/2006/main" noChangeAspect="1"/>
             </wp:cNvGraphicFramePr>
@@ -2842,7 +3773,7 @@
               <a:graphicData uri="http://schemas.openxmlformats.org/drawingml/2006/picture">
                 <pic:pic xmlns:pic="http://schemas.openxmlformats.org/drawingml/2006/picture">
                   <pic:nvPicPr>
-                    <pic:cNvPr id="0" name="Picture 11"/>
+                    <pic:cNvPr id="0" name="Picture 9"/>
                     <pic:cNvPicPr>
                       <a:picLocks noChangeAspect="1" noChangeArrowheads="1"/>
                     </pic:cNvPicPr>
@@ -2883,6 +3814,96 @@
     <w:p/>
     <w:p>
       <w:pPr>
+        <w:ind w:firstLine="0"/>
+        <w:jc w:val="center"/>
+      </w:pPr>
+      <w:r>
+        <w:t>Permite alternância entre os temas visuais do aplicativo.</w:t>
+      </w:r>
+    </w:p>
+    <w:p>
+      <w:pPr>
+        <w:ind w:firstLine="708"/>
+        <w:jc w:val="left"/>
+        <w:outlineLvl w:val="1"/>
+        <w:rPr>
+          <w:b/>
+          <w:bCs/>
+        </w:rPr>
+      </w:pPr>
+      <w:bookmarkStart w:id="15" w:name="_Toc230209417"/>
+      <w:r>
+        <w:rPr>
+          <w:b/>
+          <w:bCs/>
+        </w:rPr>
+        <w:lastRenderedPageBreak/>
+        <w:t>Sobre:</w:t>
+      </w:r>
+      <w:bookmarkEnd w:id="15"/>
+    </w:p>
+    <w:p>
+      <w:pPr>
+        <w:ind w:firstLine="0"/>
+        <w:jc w:val="center"/>
+      </w:pPr>
+      <w:r>
+        <w:rPr>
+          <w:noProof/>
+        </w:rPr>
+        <w:drawing>
+          <wp:inline distT="0" distB="0" distL="0" distR="0" wp14:anchorId="70341634" wp14:editId="67EF7D04">
+            <wp:extent cx="5400040" cy="2902585"/>
+            <wp:effectExtent l="0" t="0" r="0" b="0"/>
+            <wp:docPr id="581160763" name="Imagem 6"/>
+            <wp:cNvGraphicFramePr>
+              <a:graphicFrameLocks xmlns:a="http://schemas.openxmlformats.org/drawingml/2006/main" noChangeAspect="1"/>
+            </wp:cNvGraphicFramePr>
+            <a:graphic xmlns:a="http://schemas.openxmlformats.org/drawingml/2006/main">
+              <a:graphicData uri="http://schemas.openxmlformats.org/drawingml/2006/picture">
+                <pic:pic xmlns:pic="http://schemas.openxmlformats.org/drawingml/2006/picture">
+                  <pic:nvPicPr>
+                    <pic:cNvPr id="0" name="Picture 11"/>
+                    <pic:cNvPicPr>
+                      <a:picLocks noChangeAspect="1" noChangeArrowheads="1"/>
+                    </pic:cNvPicPr>
+                  </pic:nvPicPr>
+                  <pic:blipFill>
+                    <a:blip r:embed="rId16" cstate="print">
+                      <a:extLst>
+                        <a:ext uri="{28A0092B-C50C-407E-A947-70E740481C1C}">
+                          <a14:useLocalDpi xmlns:a14="http://schemas.microsoft.com/office/drawing/2010/main" val="0"/>
+                        </a:ext>
+                      </a:extLst>
+                    </a:blip>
+                    <a:srcRect/>
+                    <a:stretch>
+                      <a:fillRect/>
+                    </a:stretch>
+                  </pic:blipFill>
+                  <pic:spPr bwMode="auto">
+                    <a:xfrm>
+                      <a:off x="0" y="0"/>
+                      <a:ext cx="5400040" cy="2902585"/>
+                    </a:xfrm>
+                    <a:prstGeom prst="rect">
+                      <a:avLst/>
+                    </a:prstGeom>
+                    <a:noFill/>
+                    <a:ln>
+                      <a:noFill/>
+                    </a:ln>
+                  </pic:spPr>
+                </pic:pic>
+              </a:graphicData>
+            </a:graphic>
+          </wp:inline>
+        </w:drawing>
+      </w:r>
+    </w:p>
+    <w:p/>
+    <w:p>
+      <w:pPr>
         <w:ind w:firstLine="142"/>
         <w:jc w:val="center"/>
       </w:pPr>
@@ -2894,6 +3915,7 @@
     <w:p>
       <w:pPr>
         <w:ind w:firstLine="0"/>
+        <w:jc w:val="left"/>
         <w:outlineLvl w:val="0"/>
         <w:rPr>
           <w:b/>
@@ -2902,7 +3924,7 @@
           <w:szCs w:val="24"/>
         </w:rPr>
       </w:pPr>
-      <w:bookmarkStart w:id="13" w:name="_Toc230188013"/>
+      <w:bookmarkStart w:id="16" w:name="_Toc230209418"/>
       <w:r>
         <w:rPr>
           <w:b/>
@@ -2910,39 +3932,626 @@
           <w:sz w:val="28"/>
           <w:szCs w:val="24"/>
         </w:rPr>
-        <w:t>CONSIDERAÇÕES FINAIS:</w:t>
-      </w:r>
-      <w:bookmarkEnd w:id="13"/>
-    </w:p>
-    <w:p>
-      <w:r>
-        <w:t xml:space="preserve">O desenvolvimento do sistema </w:t>
+        <w:t>OBSERVAÇÕES FINAIS</w:t>
+      </w:r>
+      <w:bookmarkEnd w:id="16"/>
+    </w:p>
+    <w:p>
+      <w:r>
+        <w:t>Todos os arquivos do projeto foram organizados de forma estruturada, contendo código-fonte, arquivos de configuração, documentação e imagens utilizadas durante o desenvolvimento.</w:t>
+      </w:r>
+    </w:p>
+    <w:p>
+      <w:r>
+        <w:t xml:space="preserve">O sistema foi desenvolvido utilizando </w:t>
       </w:r>
       <w:proofErr w:type="spellStart"/>
       <w:r>
-        <w:t>PlayMusic</w:t>
+        <w:t>Flutter</w:t>
       </w:r>
       <w:proofErr w:type="spellEnd"/>
       <w:r>
-        <w:t xml:space="preserve"> permitiu aplicar conceitos relacionados ao desenvolvimento multiplataforma, persistência de dados e construção de interfaces gráficas utilizando </w:t>
+        <w:t xml:space="preserve"> com persistência local através do banco de dados </w:t>
       </w:r>
       <w:proofErr w:type="spellStart"/>
       <w:r>
+        <w:t>SQLite</w:t>
+      </w:r>
+      <w:proofErr w:type="spellEnd"/>
+      <w:r>
+        <w:t>. Durante os testes realizados, foi possível validar o funcionamento das funcionalidades implementadas, incluindo cadastro, pesquisa, exclusão, filtros, estatísticas e persistência das informações.</w:t>
+      </w:r>
+    </w:p>
+    <w:p>
+      <w:pPr>
+        <w:ind w:firstLine="0"/>
+        <w:outlineLvl w:val="1"/>
+        <w:rPr>
+          <w:b/>
+          <w:bCs/>
+        </w:rPr>
+      </w:pPr>
+      <w:bookmarkStart w:id="17" w:name="_Toc230209419"/>
+      <w:r>
+        <w:rPr>
+          <w:b/>
+          <w:bCs/>
+        </w:rPr>
+        <w:t>Instruções de configuração:</w:t>
+      </w:r>
+      <w:bookmarkEnd w:id="17"/>
+    </w:p>
+    <w:p>
+      <w:pPr>
+        <w:ind w:firstLine="0"/>
+        <w:outlineLvl w:val="1"/>
+        <w:rPr>
+          <w:b/>
+          <w:bCs/>
+        </w:rPr>
+      </w:pPr>
+      <w:bookmarkStart w:id="18" w:name="_Toc230209420"/>
+      <w:r>
+        <w:rPr>
+          <w:b/>
+          <w:bCs/>
+        </w:rPr>
+        <w:t>Para execução do projeto é necessário:</w:t>
+      </w:r>
+      <w:bookmarkEnd w:id="18"/>
+    </w:p>
+    <w:tbl>
+      <w:tblPr>
+        <w:tblStyle w:val="Tabelacomgrade"/>
+        <w:tblW w:w="0" w:type="auto"/>
+        <w:tblLook w:val="04A0" w:firstRow="1" w:lastRow="0" w:firstColumn="1" w:lastColumn="0" w:noHBand="0" w:noVBand="1"/>
+      </w:tblPr>
+      <w:tblGrid>
+        <w:gridCol w:w="8494"/>
+      </w:tblGrid>
+      <w:tr>
+        <w:tc>
+          <w:tcPr>
+            <w:tcW w:w="8494" w:type="dxa"/>
+          </w:tcPr>
+          <w:p>
+            <w:pPr>
+              <w:ind w:firstLine="0"/>
+            </w:pPr>
+            <w:proofErr w:type="spellStart"/>
+            <w:r>
+              <w:t>Flutter</w:t>
+            </w:r>
+            <w:proofErr w:type="spellEnd"/>
+            <w:r>
+              <w:t xml:space="preserve"> SDK instalado;</w:t>
+            </w:r>
+          </w:p>
+        </w:tc>
+      </w:tr>
+    </w:tbl>
+    <w:p>
+      <w:pPr>
+        <w:ind w:firstLine="0"/>
+        <w:outlineLvl w:val="1"/>
+        <w:rPr>
+          <w:b/>
+          <w:bCs/>
+        </w:rPr>
+      </w:pPr>
+      <w:bookmarkStart w:id="19" w:name="_Toc230209421"/>
+      <w:r>
+        <w:rPr>
+          <w:b/>
+          <w:bCs/>
+        </w:rPr>
+        <w:t>Dependências obtidas através do comando:</w:t>
+      </w:r>
+      <w:bookmarkEnd w:id="19"/>
+    </w:p>
+    <w:tbl>
+      <w:tblPr>
+        <w:tblStyle w:val="Tabelacomgrade"/>
+        <w:tblW w:w="0" w:type="auto"/>
+        <w:tblLook w:val="04A0" w:firstRow="1" w:lastRow="0" w:firstColumn="1" w:lastColumn="0" w:noHBand="0" w:noVBand="1"/>
+      </w:tblPr>
+      <w:tblGrid>
+        <w:gridCol w:w="8494"/>
+      </w:tblGrid>
+      <w:tr>
+        <w:tc>
+          <w:tcPr>
+            <w:tcW w:w="8494" w:type="dxa"/>
+          </w:tcPr>
+          <w:p>
+            <w:pPr>
+              <w:ind w:firstLine="0"/>
+            </w:pPr>
+            <w:proofErr w:type="spellStart"/>
+            <w:r>
+              <w:t>flutter</w:t>
+            </w:r>
+            <w:proofErr w:type="spellEnd"/>
+            <w:r>
+              <w:t xml:space="preserve"> pub </w:t>
+            </w:r>
+            <w:proofErr w:type="spellStart"/>
+            <w:r>
+              <w:t>get</w:t>
+            </w:r>
+            <w:proofErr w:type="spellEnd"/>
+          </w:p>
+        </w:tc>
+      </w:tr>
+    </w:tbl>
+    <w:p/>
+    <w:p/>
+    <w:p>
+      <w:pPr>
+        <w:ind w:firstLine="0"/>
+        <w:outlineLvl w:val="1"/>
+        <w:rPr>
+          <w:b/>
+          <w:bCs/>
+        </w:rPr>
+      </w:pPr>
+      <w:bookmarkStart w:id="20" w:name="_Toc230209422"/>
+      <w:r>
+        <w:rPr>
+          <w:b/>
+          <w:bCs/>
+        </w:rPr>
+        <w:lastRenderedPageBreak/>
+        <w:t>Para execução:</w:t>
+      </w:r>
+      <w:bookmarkEnd w:id="20"/>
+    </w:p>
+    <w:tbl>
+      <w:tblPr>
+        <w:tblStyle w:val="Tabelacomgrade"/>
+        <w:tblW w:w="0" w:type="auto"/>
+        <w:tblLook w:val="04A0" w:firstRow="1" w:lastRow="0" w:firstColumn="1" w:lastColumn="0" w:noHBand="0" w:noVBand="1"/>
+      </w:tblPr>
+      <w:tblGrid>
+        <w:gridCol w:w="8494"/>
+      </w:tblGrid>
+      <w:tr>
+        <w:tc>
+          <w:tcPr>
+            <w:tcW w:w="8494" w:type="dxa"/>
+          </w:tcPr>
+          <w:p>
+            <w:pPr>
+              <w:ind w:firstLine="0"/>
+              <w:rPr>
+                <w:lang w:val="en-US"/>
+              </w:rPr>
+            </w:pPr>
+            <w:r>
+              <w:rPr>
+                <w:lang w:val="en-US"/>
+              </w:rPr>
+              <w:t>flutter run</w:t>
+            </w:r>
+          </w:p>
+        </w:tc>
+      </w:tr>
+    </w:tbl>
+    <w:p>
+      <w:pPr>
+        <w:ind w:firstLine="0"/>
+        <w:outlineLvl w:val="1"/>
+        <w:rPr>
+          <w:b/>
+          <w:bCs/>
+          <w:lang w:val="en-US"/>
+        </w:rPr>
+      </w:pPr>
+      <w:bookmarkStart w:id="21" w:name="_Toc230209423"/>
+      <w:proofErr w:type="spellStart"/>
+      <w:r>
+        <w:rPr>
+          <w:b/>
+          <w:bCs/>
+          <w:lang w:val="en-US"/>
+        </w:rPr>
+        <w:t>Compilação</w:t>
+      </w:r>
+      <w:proofErr w:type="spellEnd"/>
+      <w:r>
+        <w:rPr>
+          <w:b/>
+          <w:bCs/>
+          <w:lang w:val="en-US"/>
+        </w:rPr>
+        <w:t xml:space="preserve"> Windows:</w:t>
+      </w:r>
+      <w:bookmarkEnd w:id="21"/>
+    </w:p>
+    <w:tbl>
+      <w:tblPr>
+        <w:tblStyle w:val="Tabelacomgrade"/>
+        <w:tblW w:w="0" w:type="auto"/>
+        <w:tblLook w:val="04A0" w:firstRow="1" w:lastRow="0" w:firstColumn="1" w:lastColumn="0" w:noHBand="0" w:noVBand="1"/>
+      </w:tblPr>
+      <w:tblGrid>
+        <w:gridCol w:w="8494"/>
+      </w:tblGrid>
+      <w:tr>
+        <w:tc>
+          <w:tcPr>
+            <w:tcW w:w="8494" w:type="dxa"/>
+          </w:tcPr>
+          <w:p>
+            <w:pPr>
+              <w:ind w:firstLine="0"/>
+              <w:rPr>
+                <w:lang w:val="en-US"/>
+              </w:rPr>
+            </w:pPr>
+            <w:r>
+              <w:rPr>
+                <w:lang w:val="en-US"/>
+              </w:rPr>
+              <w:t>flutter build windows</w:t>
+            </w:r>
+          </w:p>
+        </w:tc>
+      </w:tr>
+    </w:tbl>
+    <w:p>
+      <w:pPr>
+        <w:ind w:firstLine="0"/>
+        <w:outlineLvl w:val="1"/>
+        <w:rPr>
+          <w:b/>
+          <w:bCs/>
+          <w:lang w:val="en-US"/>
+        </w:rPr>
+      </w:pPr>
+      <w:bookmarkStart w:id="22" w:name="_Toc230209424"/>
+      <w:proofErr w:type="spellStart"/>
+      <w:r>
+        <w:rPr>
+          <w:b/>
+          <w:bCs/>
+          <w:lang w:val="en-US"/>
+        </w:rPr>
+        <w:t>Compilação</w:t>
+      </w:r>
+      <w:proofErr w:type="spellEnd"/>
+      <w:r>
+        <w:rPr>
+          <w:b/>
+          <w:bCs/>
+          <w:lang w:val="en-US"/>
+        </w:rPr>
+        <w:t xml:space="preserve"> Android:</w:t>
+      </w:r>
+      <w:bookmarkEnd w:id="22"/>
+    </w:p>
+    <w:tbl>
+      <w:tblPr>
+        <w:tblStyle w:val="Tabelacomgrade"/>
+        <w:tblW w:w="0" w:type="auto"/>
+        <w:tblLook w:val="04A0" w:firstRow="1" w:lastRow="0" w:firstColumn="1" w:lastColumn="0" w:noHBand="0" w:noVBand="1"/>
+      </w:tblPr>
+      <w:tblGrid>
+        <w:gridCol w:w="8494"/>
+      </w:tblGrid>
+      <w:tr>
+        <w:tc>
+          <w:tcPr>
+            <w:tcW w:w="8494" w:type="dxa"/>
+          </w:tcPr>
+          <w:p>
+            <w:pPr>
+              <w:ind w:firstLine="0"/>
+              <w:rPr>
+                <w:lang w:val="en-US"/>
+              </w:rPr>
+            </w:pPr>
+            <w:r>
+              <w:rPr>
+                <w:lang w:val="en-US"/>
+              </w:rPr>
+              <w:t xml:space="preserve">flutter build </w:t>
+            </w:r>
+            <w:proofErr w:type="spellStart"/>
+            <w:r>
+              <w:rPr>
+                <w:lang w:val="en-US"/>
+              </w:rPr>
+              <w:t>apk</w:t>
+            </w:r>
+            <w:proofErr w:type="spellEnd"/>
+            <w:r>
+              <w:rPr>
+                <w:lang w:val="en-US"/>
+              </w:rPr>
+              <w:t xml:space="preserve"> --release</w:t>
+            </w:r>
+          </w:p>
+        </w:tc>
+      </w:tr>
+    </w:tbl>
+    <w:p>
+      <w:pPr>
+        <w:ind w:firstLine="0"/>
+        <w:outlineLvl w:val="1"/>
+        <w:rPr>
+          <w:b/>
+          <w:bCs/>
+        </w:rPr>
+      </w:pPr>
+      <w:bookmarkStart w:id="23" w:name="_Toc230209425"/>
+      <w:r>
+        <w:rPr>
+          <w:b/>
+          <w:bCs/>
+        </w:rPr>
+        <w:t>Banco de dados:</w:t>
+      </w:r>
+      <w:bookmarkEnd w:id="23"/>
+    </w:p>
+    <w:p>
+      <w:r>
+        <w:t xml:space="preserve">O projeto utiliza banco local </w:t>
+      </w:r>
+      <w:proofErr w:type="spellStart"/>
+      <w:r>
+        <w:t>SQLite</w:t>
+      </w:r>
+      <w:proofErr w:type="spellEnd"/>
+      <w:r>
+        <w:t>. A conexão ocorre automaticamente através do serviço de banco implementado na aplicação, não sendo necessária configuração manual adicional.</w:t>
+      </w:r>
+    </w:p>
+    <w:p>
+      <w:pPr>
+        <w:ind w:firstLine="0"/>
+      </w:pPr>
+      <w:r>
+        <w:t>Estrutura do projeto:</w:t>
+      </w:r>
+    </w:p>
+    <w:p>
+      <w:pPr>
+        <w:ind w:firstLine="0"/>
+        <w:outlineLvl w:val="1"/>
+        <w:rPr>
+          <w:b/>
+          <w:bCs/>
+        </w:rPr>
+      </w:pPr>
+      <w:bookmarkStart w:id="24" w:name="_Toc230209426"/>
+      <w:r>
+        <w:rPr>
+          <w:b/>
+          <w:bCs/>
+        </w:rPr>
+        <w:t>O código foi organizado utilizando separação por:</w:t>
+      </w:r>
+      <w:bookmarkEnd w:id="24"/>
+    </w:p>
+    <w:tbl>
+      <w:tblPr>
+        <w:tblStyle w:val="Tabelacomgrade"/>
+        <w:tblW w:w="0" w:type="auto"/>
+        <w:tblLook w:val="04A0" w:firstRow="1" w:lastRow="0" w:firstColumn="1" w:lastColumn="0" w:noHBand="0" w:noVBand="1"/>
+      </w:tblPr>
+      <w:tblGrid>
+        <w:gridCol w:w="8494"/>
+      </w:tblGrid>
+      <w:tr>
+        <w:tc>
+          <w:tcPr>
+            <w:tcW w:w="8494" w:type="dxa"/>
+          </w:tcPr>
+          <w:p>
+            <w:pPr>
+              <w:ind w:firstLine="0"/>
+            </w:pPr>
+            <w:proofErr w:type="spellStart"/>
+            <w:r>
+              <w:t>Database</w:t>
+            </w:r>
+            <w:proofErr w:type="spellEnd"/>
+          </w:p>
+          <w:p>
+            <w:pPr>
+              <w:ind w:firstLine="0"/>
+            </w:pPr>
+            <w:r>
+              <w:t>models</w:t>
+            </w:r>
+          </w:p>
+          <w:p>
+            <w:pPr>
+              <w:ind w:firstLine="0"/>
+            </w:pPr>
+            <w:proofErr w:type="spellStart"/>
+            <w:r>
+              <w:t>pages</w:t>
+            </w:r>
+            <w:proofErr w:type="spellEnd"/>
+          </w:p>
+          <w:p>
+            <w:pPr>
+              <w:ind w:firstLine="0"/>
+            </w:pPr>
+            <w:r>
+              <w:t>widgets</w:t>
+            </w:r>
+          </w:p>
+        </w:tc>
+      </w:tr>
+    </w:tbl>
+    <w:p>
+      <w:pPr>
+        <w:ind w:firstLine="0"/>
+        <w:outlineLvl w:val="1"/>
+        <w:rPr>
+          <w:b/>
+          <w:bCs/>
+        </w:rPr>
+      </w:pPr>
+      <w:bookmarkStart w:id="25" w:name="_Toc230209427"/>
+      <w:r>
+        <w:rPr>
+          <w:b/>
+          <w:bCs/>
+        </w:rPr>
+        <w:t>Principais recursos implementados:</w:t>
+      </w:r>
+      <w:bookmarkEnd w:id="25"/>
+    </w:p>
+    <w:tbl>
+      <w:tblPr>
+        <w:tblStyle w:val="Tabelacomgrade"/>
+        <w:tblW w:w="0" w:type="auto"/>
+        <w:tblLook w:val="04A0" w:firstRow="1" w:lastRow="0" w:firstColumn="1" w:lastColumn="0" w:noHBand="0" w:noVBand="1"/>
+      </w:tblPr>
+      <w:tblGrid>
+        <w:gridCol w:w="8494"/>
+      </w:tblGrid>
+      <w:tr>
+        <w:tc>
+          <w:tcPr>
+            <w:tcW w:w="8494" w:type="dxa"/>
+          </w:tcPr>
+          <w:p>
+            <w:pPr>
+              <w:ind w:firstLine="0"/>
+            </w:pPr>
+            <w:r>
+              <w:t>Cadastro de músicas;</w:t>
+            </w:r>
+          </w:p>
+          <w:p>
+            <w:pPr>
+              <w:ind w:firstLine="0"/>
+            </w:pPr>
+            <w:r>
+              <w:t>Exclusão de registros;</w:t>
+            </w:r>
+          </w:p>
+          <w:p>
+            <w:pPr>
+              <w:ind w:firstLine="0"/>
+            </w:pPr>
+            <w:r>
+              <w:t>Pesquisa dinâmica;</w:t>
+            </w:r>
+          </w:p>
+          <w:p>
+            <w:pPr>
+              <w:ind w:firstLine="0"/>
+            </w:pPr>
+            <w:r>
+              <w:t>Filtro por gênero;</w:t>
+            </w:r>
+          </w:p>
+          <w:p>
+            <w:pPr>
+              <w:ind w:firstLine="0"/>
+            </w:pPr>
+            <w:r>
+              <w:t>Dashboard;</w:t>
+            </w:r>
+          </w:p>
+          <w:p>
+            <w:pPr>
+              <w:ind w:firstLine="0"/>
+            </w:pPr>
+            <w:r>
+              <w:t>Estatísticas;</w:t>
+            </w:r>
+          </w:p>
+          <w:p>
+            <w:pPr>
+              <w:ind w:firstLine="0"/>
+            </w:pPr>
+            <w:r>
+              <w:t xml:space="preserve">Persistência </w:t>
+            </w:r>
+            <w:proofErr w:type="spellStart"/>
+            <w:r>
+              <w:t>SQLite</w:t>
+            </w:r>
+            <w:proofErr w:type="spellEnd"/>
+            <w:r>
+              <w:t>;</w:t>
+            </w:r>
+          </w:p>
+          <w:p>
+            <w:pPr>
+              <w:ind w:firstLine="0"/>
+            </w:pPr>
+            <w:r>
+              <w:t>Tema claro/escuro;</w:t>
+            </w:r>
+          </w:p>
+          <w:p>
+            <w:pPr>
+              <w:ind w:firstLine="0"/>
+            </w:pPr>
+            <w:r>
+              <w:t>Tela Sobre.</w:t>
+            </w:r>
+          </w:p>
+        </w:tc>
+      </w:tr>
+    </w:tbl>
+    <w:p>
+      <w:pPr>
+        <w:ind w:firstLine="0"/>
+        <w:outlineLvl w:val="1"/>
+        <w:rPr>
+          <w:b/>
+          <w:bCs/>
+        </w:rPr>
+      </w:pPr>
+      <w:bookmarkStart w:id="26" w:name="_Toc230209428"/>
+      <w:r>
+        <w:rPr>
+          <w:b/>
+          <w:bCs/>
+        </w:rPr>
+        <w:t>Dificuldades encontradas:</w:t>
+      </w:r>
+      <w:bookmarkEnd w:id="26"/>
+    </w:p>
+    <w:p>
+      <w:r>
+        <w:t xml:space="preserve">Durante o desenvolvimento ocorreram dificuldades relacionadas à organização inicial da estrutura do projeto, configuração do </w:t>
+      </w:r>
+      <w:proofErr w:type="spellStart"/>
+      <w:r>
         <w:t>Flutter</w:t>
       </w:r>
       <w:proofErr w:type="spellEnd"/>
       <w:r>
+        <w:t xml:space="preserve"> e integração das funcionalidades utilizando </w:t>
+      </w:r>
+      <w:proofErr w:type="spellStart"/>
+      <w:r>
+        <w:t>SQLite</w:t>
+      </w:r>
+      <w:proofErr w:type="spellEnd"/>
+      <w:r>
         <w:t>.</w:t>
       </w:r>
     </w:p>
     <w:p>
-      <w:r>
-        <w:t>Além dos conceitos técnicos aplicados, o projeto possibilitou compreender práticas relacionadas ao armazenamento local, gerenciamento de informações e desenvolvimento de aplicações funcionais.</w:t>
-      </w:r>
+      <w:pPr>
+        <w:pStyle w:val="PargrafodaLista"/>
+        <w:ind w:firstLine="0"/>
+      </w:pPr>
     </w:p>
     <w:sectPr>
-      <w:headerReference w:type="default" r:id="rId16"/>
-      <w:footerReference w:type="default" r:id="rId17"/>
+      <w:headerReference w:type="default" r:id="rId17"/>
+      <w:footerReference w:type="default" r:id="rId18"/>
       <w:pgSz w:w="11906" w:h="16838"/>
       <w:pgMar w:top="1417" w:right="1701" w:bottom="1417" w:left="1701" w:header="708" w:footer="708" w:gutter="0"/>
       <w:cols w:space="708"/>
@@ -3030,7 +4639,7 @@
           <w:t>Desenvolvimento Multiplataforma Desktop</w:t>
         </w:r>
         <w:r>
-          <w:t xml:space="preserve">                                                                                 </w:t>
+          <w:t xml:space="preserve">                                                                               </w:t>
         </w:r>
         <w:r>
           <w:fldChar w:fldCharType="begin"/>
@@ -3291,6 +4900,119 @@
 <file path=word/numbering.xml><?xml version="1.0" encoding="utf-8"?>
 <w:numbering xmlns:wpc="http://schemas.microsoft.com/office/word/2010/wordprocessingCanvas" xmlns:cx="http://schemas.microsoft.com/office/drawing/2014/chartex" xmlns:cx1="http://schemas.microsoft.com/office/drawing/2015/9/8/chartex" xmlns:cx2="http://schemas.microsoft.com/office/drawing/2015/10/21/chartex" xmlns:cx3="http://schemas.microsoft.com/office/drawing/2016/5/9/chartex" xmlns:cx4="http://schemas.microsoft.com/office/drawing/2016/5/10/chartex" xmlns:cx5="http://schemas.microsoft.com/office/drawing/2016/5/11/chartex" xmlns:cx6="http://schemas.microsoft.com/office/drawing/2016/5/12/chartex" xmlns:cx7="http://schemas.microsoft.com/office/drawing/2016/5/13/chartex" xmlns:cx8="http://schemas.microsoft.com/office/drawing/2016/5/14/chartex" xmlns:mc="http://schemas.openxmlformats.org/markup-compatibility/2006" xmlns:aink="http://schemas.microsoft.com/office/drawing/2016/ink" xmlns:am3d="http://schemas.microsoft.com/office/drawing/2017/model3d" xmlns:o="urn:schemas-microsoft-com:office:office" xmlns:oel="http://schemas.microsoft.com/office/2019/extlst" xmlns:r="http://schemas.openxmlformats.org/officeDocument/2006/relationships" xmlns:m="http://schemas.openxmlformats.org/officeDocument/2006/math" xmlns:v="urn:schemas-microsoft-com:vml" xmlns:wp14="http://schemas.microsoft.com/office/word/2010/wordprocessingDrawing" xmlns:wp="http://schemas.openxmlformats.org/drawingml/2006/wordprocessingDrawing" xmlns:w10="urn:schemas-microsoft-com:office:word" xmlns:w="http://schemas.openxmlformats.org/wordprocessingml/2006/main" xmlns:w14="http://schemas.microsoft.com/office/word/2010/wordml" xmlns:w15="http://schemas.microsoft.com/office/word/2012/wordml" xmlns:w16cex="http://schemas.microsoft.com/office/word/2018/wordml/cex" xmlns:w16cid="http://schemas.microsoft.com/office/word/2016/wordml/cid" xmlns:w16="http://schemas.microsoft.com/office/word/2018/wordml" xmlns:w16du="http://schemas.microsoft.com/office/word/2023/wordml/word16du" xmlns:w16sdtdh="http://schemas.microsoft.com/office/word/2020/wordml/sdtdatahash" xmlns:w16se="http://schemas.microsoft.com/office/word/2015/wordml/symex" xmlns:wpg="http://schemas.microsoft.com/office/word/2010/wordprocessingGroup" xmlns:wpi="http://schemas.microsoft.com/office/word/2010/wordprocessingInk" xmlns:wne="http://schemas.microsoft.com/office/word/2006/wordml" xmlns:wps="http://schemas.microsoft.com/office/word/2010/wordprocessingShape" mc:Ignorable="w14 w15 w16se w16cid w16 w16cex w16sdtdh w16du wp14">
   <w:abstractNum w:abstractNumId="0" w15:restartNumberingAfterBreak="0">
+    <w:nsid w:val="077C5466"/>
+    <w:multiLevelType w:val="hybridMultilevel"/>
+    <w:tmpl w:val="4F0034F8"/>
+    <w:lvl w:ilvl="0" w:tplc="04090001">
+      <w:start w:val="1"/>
+      <w:numFmt w:val="bullet"/>
+      <w:lvlText w:val=""/>
+      <w:lvlJc w:val="left"/>
+      <w:pPr>
+        <w:ind w:left="720" w:hanging="360"/>
+      </w:pPr>
+      <w:rPr>
+        <w:rFonts w:ascii="Symbol" w:hAnsi="Symbol" w:hint="default"/>
+      </w:rPr>
+    </w:lvl>
+    <w:lvl w:ilvl="1" w:tplc="04090003" w:tentative="1">
+      <w:start w:val="1"/>
+      <w:numFmt w:val="bullet"/>
+      <w:lvlText w:val="o"/>
+      <w:lvlJc w:val="left"/>
+      <w:pPr>
+        <w:ind w:left="1440" w:hanging="360"/>
+      </w:pPr>
+      <w:rPr>
+        <w:rFonts w:ascii="Courier New" w:hAnsi="Courier New" w:cs="Courier New" w:hint="default"/>
+      </w:rPr>
+    </w:lvl>
+    <w:lvl w:ilvl="2" w:tplc="04090005" w:tentative="1">
+      <w:start w:val="1"/>
+      <w:numFmt w:val="bullet"/>
+      <w:lvlText w:val=""/>
+      <w:lvlJc w:val="left"/>
+      <w:pPr>
+        <w:ind w:left="2160" w:hanging="360"/>
+      </w:pPr>
+      <w:rPr>
+        <w:rFonts w:ascii="Wingdings" w:hAnsi="Wingdings" w:hint="default"/>
+      </w:rPr>
+    </w:lvl>
+    <w:lvl w:ilvl="3" w:tplc="04090001" w:tentative="1">
+      <w:start w:val="1"/>
+      <w:numFmt w:val="bullet"/>
+      <w:lvlText w:val=""/>
+      <w:lvlJc w:val="left"/>
+      <w:pPr>
+        <w:ind w:left="2880" w:hanging="360"/>
+      </w:pPr>
+      <w:rPr>
+        <w:rFonts w:ascii="Symbol" w:hAnsi="Symbol" w:hint="default"/>
+      </w:rPr>
+    </w:lvl>
+    <w:lvl w:ilvl="4" w:tplc="04090003" w:tentative="1">
+      <w:start w:val="1"/>
+      <w:numFmt w:val="bullet"/>
+      <w:lvlText w:val="o"/>
+      <w:lvlJc w:val="left"/>
+      <w:pPr>
+        <w:ind w:left="3600" w:hanging="360"/>
+      </w:pPr>
+      <w:rPr>
+        <w:rFonts w:ascii="Courier New" w:hAnsi="Courier New" w:cs="Courier New" w:hint="default"/>
+      </w:rPr>
+    </w:lvl>
+    <w:lvl w:ilvl="5" w:tplc="04090005" w:tentative="1">
+      <w:start w:val="1"/>
+      <w:numFmt w:val="bullet"/>
+      <w:lvlText w:val=""/>
+      <w:lvlJc w:val="left"/>
+      <w:pPr>
+        <w:ind w:left="4320" w:hanging="360"/>
+      </w:pPr>
+      <w:rPr>
+        <w:rFonts w:ascii="Wingdings" w:hAnsi="Wingdings" w:hint="default"/>
+      </w:rPr>
+    </w:lvl>
+    <w:lvl w:ilvl="6" w:tplc="04090001" w:tentative="1">
+      <w:start w:val="1"/>
+      <w:numFmt w:val="bullet"/>
+      <w:lvlText w:val=""/>
+      <w:lvlJc w:val="left"/>
+      <w:pPr>
+        <w:ind w:left="5040" w:hanging="360"/>
+      </w:pPr>
+      <w:rPr>
+        <w:rFonts w:ascii="Symbol" w:hAnsi="Symbol" w:hint="default"/>
+      </w:rPr>
+    </w:lvl>
+    <w:lvl w:ilvl="7" w:tplc="04090003" w:tentative="1">
+      <w:start w:val="1"/>
+      <w:numFmt w:val="bullet"/>
+      <w:lvlText w:val="o"/>
+      <w:lvlJc w:val="left"/>
+      <w:pPr>
+        <w:ind w:left="5760" w:hanging="360"/>
+      </w:pPr>
+      <w:rPr>
+        <w:rFonts w:ascii="Courier New" w:hAnsi="Courier New" w:cs="Courier New" w:hint="default"/>
+      </w:rPr>
+    </w:lvl>
+    <w:lvl w:ilvl="8" w:tplc="04090005" w:tentative="1">
+      <w:start w:val="1"/>
+      <w:numFmt w:val="bullet"/>
+      <w:lvlText w:val=""/>
+      <w:lvlJc w:val="left"/>
+      <w:pPr>
+        <w:ind w:left="6480" w:hanging="360"/>
+      </w:pPr>
+      <w:rPr>
+        <w:rFonts w:ascii="Wingdings" w:hAnsi="Wingdings" w:hint="default"/>
+      </w:rPr>
+    </w:lvl>
+  </w:abstractNum>
+  <w:abstractNum w:abstractNumId="1" w15:restartNumberingAfterBreak="0">
     <w:nsid w:val="24B97CB9"/>
     <w:multiLevelType w:val="multilevel"/>
     <w:tmpl w:val="4FD2800C"/>
@@ -3439,7 +5161,7 @@
       </w:rPr>
     </w:lvl>
   </w:abstractNum>
-  <w:abstractNum w:abstractNumId="1" w15:restartNumberingAfterBreak="0">
+  <w:abstractNum w:abstractNumId="2" w15:restartNumberingAfterBreak="0">
     <w:nsid w:val="265F5108"/>
     <w:multiLevelType w:val="hybridMultilevel"/>
     <w:tmpl w:val="D37CBF66"/>
@@ -3552,10 +5274,10 @@
       </w:rPr>
     </w:lvl>
   </w:abstractNum>
-  <w:abstractNum w:abstractNumId="2" w15:restartNumberingAfterBreak="0">
+  <w:abstractNum w:abstractNumId="3" w15:restartNumberingAfterBreak="0">
     <w:nsid w:val="2DFC4F7F"/>
     <w:multiLevelType w:val="hybridMultilevel"/>
-    <w:tmpl w:val="EBEED2C2"/>
+    <w:tmpl w:val="A380D182"/>
     <w:lvl w:ilvl="0" w:tplc="04160001">
       <w:start w:val="1"/>
       <w:numFmt w:val="bullet"/>
@@ -3665,7 +5387,7 @@
       </w:rPr>
     </w:lvl>
   </w:abstractNum>
-  <w:abstractNum w:abstractNumId="3" w15:restartNumberingAfterBreak="0">
+  <w:abstractNum w:abstractNumId="4" w15:restartNumberingAfterBreak="0">
     <w:nsid w:val="45E17F1C"/>
     <w:multiLevelType w:val="multilevel"/>
     <w:tmpl w:val="4D88CDB2"/>
@@ -3815,16 +5537,19 @@
     </w:lvl>
   </w:abstractNum>
   <w:num w:numId="1" w16cid:durableId="1438284610">
+    <w:abstractNumId w:val="4"/>
+  </w:num>
+  <w:num w:numId="2" w16cid:durableId="1813012127">
+    <w:abstractNumId w:val="1"/>
+  </w:num>
+  <w:num w:numId="3" w16cid:durableId="1243753642">
     <w:abstractNumId w:val="3"/>
   </w:num>
-  <w:num w:numId="2" w16cid:durableId="1813012127">
-    <w:abstractNumId w:val="0"/>
-  </w:num>
-  <w:num w:numId="3" w16cid:durableId="1243753642">
+  <w:num w:numId="4" w16cid:durableId="441461629">
     <w:abstractNumId w:val="2"/>
   </w:num>
-  <w:num w:numId="4" w16cid:durableId="441461629">
-    <w:abstractNumId w:val="1"/>
+  <w:num w:numId="5" w16cid:durableId="1256091275">
+    <w:abstractNumId w:val="0"/>
   </w:num>
 </w:numbering>
 </file>
@@ -4962,6 +6687,18 @@
       <w:u w:val="single"/>
     </w:rPr>
   </w:style>
+  <w:style w:type="character" w:styleId="MenoPendente">
+    <w:name w:val="Unresolved Mention"/>
+    <w:basedOn w:val="Fontepargpadro"/>
+    <w:uiPriority w:val="99"/>
+    <w:semiHidden/>
+    <w:unhideWhenUsed/>
+    <w:rsid w:val="009B4495"/>
+    <w:rPr>
+      <w:color w:val="605E5C"/>
+      <w:shd w:val="clear" w:color="auto" w:fill="E1DFDD"/>
+    </w:rPr>
+  </w:style>
 </w:styles>
 </file>
 

</xml_diff>